<commit_message>
Edited The Carousel Between Us files and added a new version The Carousel Between Us01.md
</commit_message>
<xml_diff>
--- a/The Carousel Between Us.docx
+++ b/The Carousel Between Us.docx
@@ -208,6 +208,9 @@
       <w:r>
         <w:t>.</w:t>
       </w:r>
+      <w:r>
+        <w:t xml:space="preserve"> They filled her in on the latest in the joke war between Mike and Steve and how Carl and his bandmates got involved.</w:t>
+      </w:r>
     </w:p>
     <w:p>
       <w:pPr>
@@ -257,7 +260,37 @@
         <w:t>medications she had been given after surgery</w:t>
       </w:r>
       <w:r>
-        <w:t>. She was replaying the conversation and thinking about her own state fair. They were both booked for a state fair and enjoying something that made them feel young again by riding the rides, eating the food, and watching the shows. It made her feel young again too. She drifted off</w:t>
+        <w:t xml:space="preserve">. She was replaying the conversation and thinking about her own state fair. They were both booked for </w:t>
+      </w:r>
+      <w:r>
+        <w:t>the same</w:t>
+      </w:r>
+      <w:r>
+        <w:t xml:space="preserve"> state fair</w:t>
+      </w:r>
+      <w:r>
+        <w:t>.</w:t>
+      </w:r>
+      <w:r>
+        <w:t xml:space="preserve"> </w:t>
+      </w:r>
+      <w:r>
+        <w:t xml:space="preserve">They were </w:t>
+      </w:r>
+      <w:r>
+        <w:t xml:space="preserve">enjoying something </w:t>
+      </w:r>
+      <w:r>
+        <w:t>which</w:t>
+      </w:r>
+      <w:r>
+        <w:t xml:space="preserve"> made them feel young again by riding the rides, eating the food, and watching the shows. </w:t>
+      </w:r>
+      <w:r>
+        <w:t>Their enthusiasm</w:t>
+      </w:r>
+      <w:r>
+        <w:t xml:space="preserve"> made her feel young again too. She drifted off</w:t>
       </w:r>
       <w:r>
         <w:t>,</w:t>
@@ -438,43 +471,818 @@
         <w:t xml:space="preserve"> day</w:t>
       </w:r>
       <w:r>
+        <w:t>.</w:t>
+      </w:r>
+      <w:r>
+        <w:t xml:space="preserve"> </w:t>
+      </w:r>
+      <w:r>
+        <w:t>The</w:t>
+      </w:r>
+      <w:r>
+        <w:t xml:space="preserve"> </w:t>
+      </w:r>
+      <w:r>
+        <w:t xml:space="preserve">perfect day for spending time at the lake and later at </w:t>
+      </w:r>
+      <w:r>
+        <w:t xml:space="preserve">the </w:t>
+      </w:r>
+      <w:r>
+        <w:t xml:space="preserve">carnival </w:t>
+      </w:r>
+      <w:r>
+        <w:t>outside of</w:t>
+      </w:r>
+      <w:r>
+        <w:t xml:space="preserve"> town.</w:t>
+      </w:r>
+      <w:r>
+        <w:t xml:space="preserve"> </w:t>
+      </w:r>
+      <w:r>
+        <w:t>Some normalcy for her brothers they don’t otherwise get, and a break from the mundane for her. T</w:t>
+      </w:r>
+      <w:r>
+        <w:t>he windows</w:t>
+      </w:r>
+      <w:r>
+        <w:t xml:space="preserve"> </w:t>
+      </w:r>
+      <w:r>
+        <w:t xml:space="preserve">are </w:t>
+      </w:r>
+      <w:r>
+        <w:t>cranked</w:t>
+      </w:r>
+      <w:r>
+        <w:t xml:space="preserve"> dow</w:t>
+      </w:r>
+      <w:r>
+        <w:t>n</w:t>
+      </w:r>
+      <w:r>
+        <w:t>,</w:t>
+      </w:r>
+      <w:r>
+        <w:t xml:space="preserve"> letting the breeze make it comfortable and not overbearing. The smell of pine, warmed earth, and sage drift</w:t>
+      </w:r>
+      <w:r>
+        <w:t>s</w:t>
+      </w:r>
+      <w:r>
+        <w:t xml:space="preserve"> through as she takes a deep breath and lets it out slowly. The peace is short</w:t>
+      </w:r>
+      <w:r>
+        <w:t>-</w:t>
+      </w:r>
+      <w:r>
+        <w:t xml:space="preserve">lived as the deep breath causes the </w:t>
+      </w:r>
+      <w:r>
+        <w:t>shelf bra in her swimsuit to roll up.</w:t>
+      </w:r>
+    </w:p>
+    <w:p>
+      <w:pPr>
+        <w:keepNext w:val="0"/>
+        <w:keepLines w:val="0"/>
+      </w:pPr>
+      <w:r>
+        <w:t xml:space="preserve">She </w:t>
+      </w:r>
+      <w:r>
+        <w:t xml:space="preserve">has </w:t>
+      </w:r>
+      <w:r>
+        <w:t xml:space="preserve">just </w:t>
+      </w:r>
+      <w:r>
+        <w:t>finishe</w:t>
+      </w:r>
+      <w:r>
+        <w:t>d</w:t>
+      </w:r>
+      <w:r>
+        <w:t xml:space="preserve"> tugging it back down when she </w:t>
+      </w:r>
+      <w:r>
+        <w:t>hear</w:t>
+      </w:r>
+      <w:r>
+        <w:t>s</w:t>
+      </w:r>
+      <w:r>
+        <w:t xml:space="preserve"> the doors swish open</w:t>
+      </w:r>
+      <w:r>
+        <w:t>.</w:t>
+      </w:r>
+      <w:r>
+        <w:t xml:space="preserve"> </w:t>
+      </w:r>
+      <w:r>
+        <w:t>Mary</w:t>
+      </w:r>
+      <w:r>
+        <w:t xml:space="preserve"> look</w:t>
+      </w:r>
+      <w:r>
+        <w:t>s</w:t>
+      </w:r>
+      <w:r>
+        <w:t xml:space="preserve"> up to see </w:t>
+      </w:r>
+      <w:r>
+        <w:t>Carl</w:t>
+      </w:r>
+      <w:r>
+        <w:t xml:space="preserve"> and </w:t>
+      </w:r>
+      <w:r>
+        <w:t>Mike</w:t>
+      </w:r>
+      <w:r>
+        <w:t xml:space="preserve"> walking shoulder to shoulder with shit-eating grins on their faces</w:t>
+      </w:r>
+      <w:r>
+        <w:t>.</w:t>
+      </w:r>
+      <w:r>
+        <w:t xml:space="preserve"> </w:t>
+      </w:r>
+      <w:r>
+        <w:t>T</w:t>
+      </w:r>
+      <w:r>
+        <w:t>hey stop short of the car</w:t>
+      </w:r>
+      <w:r>
+        <w:t>.</w:t>
+      </w:r>
+      <w:r>
+        <w:t xml:space="preserve"> </w:t>
+      </w:r>
+      <w:r>
+        <w:t>They</w:t>
+      </w:r>
+      <w:r>
+        <w:t xml:space="preserve"> part ways to reveal </w:t>
+      </w:r>
+      <w:r>
+        <w:t>Steve</w:t>
+      </w:r>
+      <w:r>
+        <w:t xml:space="preserve"> and present him like he is prize on a game show. He is</w:t>
+      </w:r>
+      <w:r>
+        <w:t xml:space="preserve"> blindfolded</w:t>
+      </w:r>
+      <w:r>
+        <w:t xml:space="preserve"> with a bandana</w:t>
+      </w:r>
+      <w:r>
+        <w:t>, but otherwise unrestrained</w:t>
+      </w:r>
+      <w:r>
+        <w:t>.</w:t>
+      </w:r>
+      <w:r>
+        <w:t xml:space="preserve"> </w:t>
+      </w:r>
+      <w:r>
+        <w:t>It appears he is</w:t>
+      </w:r>
+      <w:r>
+        <w:t xml:space="preserve"> willingly being led to the car</w:t>
+      </w:r>
+      <w:r>
+        <w:t xml:space="preserve"> by her brothers</w:t>
+      </w:r>
+      <w:r>
+        <w:t xml:space="preserve">. </w:t>
+      </w:r>
+      <w:r>
+        <w:t>Mary feels the freeze start</w:t>
+      </w:r>
+      <w:r>
+        <w:t>.</w:t>
+      </w:r>
+      <w:r>
+        <w:t xml:space="preserve"> </w:t>
+      </w:r>
+      <w:r>
+        <w:t>It</w:t>
+      </w:r>
+      <w:r>
+        <w:t xml:space="preserve"> begin</w:t>
+      </w:r>
+      <w:r>
+        <w:t>s</w:t>
+      </w:r>
+      <w:r>
+        <w:t xml:space="preserve"> to take hold of her, silencing any angry words she would unleash on the two</w:t>
+      </w:r>
+      <w:r>
+        <w:t xml:space="preserve"> for this setup</w:t>
+      </w:r>
+      <w:r>
+        <w:t>.</w:t>
+      </w:r>
+    </w:p>
+    <w:p>
+      <w:pPr>
+        <w:keepNext w:val="0"/>
+        <w:keepLines w:val="0"/>
+      </w:pPr>
+      <w:r>
+        <w:t>Mary watches on as t</w:t>
+      </w:r>
+      <w:r>
+        <w:t>hey</w:t>
+      </w:r>
+      <w:r>
+        <w:t xml:space="preserve"> go through the awkward motion of</w:t>
+      </w:r>
+      <w:r>
+        <w:t xml:space="preserve"> </w:t>
+      </w:r>
+      <w:r>
+        <w:t>trying to stuff</w:t>
+      </w:r>
+      <w:r>
+        <w:t xml:space="preserve"> him in the front seat</w:t>
+      </w:r>
+      <w:r>
+        <w:t>. After a couple of tries imitating a police officer putting a handcuffed person in the back of a squad car, they realize they have to get in first</w:t>
+      </w:r>
+      <w:r>
+        <w:t xml:space="preserve"> or fold him in half to occupy the </w:t>
+      </w:r>
+      <w:r>
+        <w:t>back</w:t>
+      </w:r>
+      <w:r>
+        <w:t xml:space="preserve"> seats</w:t>
+      </w:r>
+      <w:r>
+        <w:t>.</w:t>
+      </w:r>
+      <w:r>
+        <w:t xml:space="preserve"> </w:t>
+      </w:r>
+      <w:r>
+        <w:t>Carl</w:t>
+      </w:r>
+      <w:r>
+        <w:t xml:space="preserve"> get</w:t>
+      </w:r>
+      <w:r>
+        <w:t>s</w:t>
+      </w:r>
+      <w:r>
+        <w:t xml:space="preserve"> in</w:t>
+      </w:r>
+      <w:r>
+        <w:t xml:space="preserve"> first sliding in behind Mary.</w:t>
+      </w:r>
+      <w:r>
+        <w:t xml:space="preserve"> Mike</w:t>
+      </w:r>
+      <w:r>
+        <w:t xml:space="preserve"> climbs in and pulls the passenger seat back. He</w:t>
+      </w:r>
+      <w:r>
+        <w:t xml:space="preserve"> half hangs out the window of the car, </w:t>
+      </w:r>
+      <w:r>
+        <w:t>guid</w:t>
+      </w:r>
+      <w:r>
+        <w:t>ing Steve</w:t>
+      </w:r>
+      <w:r>
+        <w:t xml:space="preserve"> where to put his hands so he may</w:t>
+      </w:r>
+      <w:r>
+        <w:t xml:space="preserve"> get in</w:t>
+      </w:r>
+      <w:r>
+        <w:t>to</w:t>
+      </w:r>
+      <w:r>
+        <w:t xml:space="preserve"> the front seat.</w:t>
+      </w:r>
+      <w:r>
+        <w:t xml:space="preserve"> </w:t>
+      </w:r>
+      <w:r>
+        <w:t xml:space="preserve">Once Steve is settled and the door is closed, </w:t>
+      </w:r>
+      <w:r>
+        <w:t>Mary</w:t>
+      </w:r>
+      <w:r>
+        <w:t xml:space="preserve"> turn</w:t>
+      </w:r>
+      <w:r>
+        <w:t>s</w:t>
+      </w:r>
+      <w:r>
+        <w:t xml:space="preserve"> and glare</w:t>
+      </w:r>
+      <w:r>
+        <w:t>s</w:t>
+      </w:r>
+      <w:r>
+        <w:t xml:space="preserve"> at them</w:t>
+      </w:r>
+      <w:r>
+        <w:t>.</w:t>
+      </w:r>
+      <w:r>
+        <w:t xml:space="preserve"> </w:t>
+      </w:r>
+      <w:r>
+        <w:t>Carl is</w:t>
+      </w:r>
+      <w:r>
+        <w:t xml:space="preserve"> still grinning from ear to ear</w:t>
+      </w:r>
+      <w:r>
+        <w:t>.</w:t>
+      </w:r>
+    </w:p>
+    <w:p>
+      <w:pPr>
+        <w:keepNext w:val="0"/>
+        <w:keepLines w:val="0"/>
+      </w:pPr>
+      <w:r>
+        <w:t>“G</w:t>
+      </w:r>
+      <w:r>
+        <w:t>o on and buckle him in</w:t>
+      </w:r>
+      <w:r>
+        <w:t>,”</w:t>
+      </w:r>
+      <w:r>
+        <w:t xml:space="preserve"> </w:t>
+      </w:r>
+      <w:r>
+        <w:t xml:space="preserve">Carl says, </w:t>
+      </w:r>
+      <w:r>
+        <w:t xml:space="preserve">and points suggestively </w:t>
+      </w:r>
+      <w:r>
+        <w:t>at Steve’s</w:t>
+      </w:r>
+      <w:r>
+        <w:t xml:space="preserve"> lap. </w:t>
+      </w:r>
+    </w:p>
+    <w:p>
+      <w:pPr>
+        <w:keepNext w:val="0"/>
+        <w:keepLines w:val="0"/>
+      </w:pPr>
+      <w:r>
+        <w:t>Mary looks</w:t>
+      </w:r>
+      <w:r>
+        <w:t xml:space="preserve"> </w:t>
+      </w:r>
+      <w:r>
+        <w:t xml:space="preserve">over </w:t>
+      </w:r>
+      <w:r>
+        <w:t xml:space="preserve">at </w:t>
+      </w:r>
+      <w:r>
+        <w:t>Mike</w:t>
+      </w:r>
+      <w:r>
+        <w:t>.</w:t>
+      </w:r>
+      <w:r>
+        <w:t xml:space="preserve"> </w:t>
+      </w:r>
+      <w:r>
+        <w:t>“Go on. Nice Daisy Duke outfit you got going on there</w:t>
+      </w:r>
+      <w:r>
+        <w:t>,” he comments as he finger</w:t>
+      </w:r>
+      <w:r>
+        <w:t>-</w:t>
+      </w:r>
+      <w:r>
+        <w:t>waves to prompt her.</w:t>
+      </w:r>
+    </w:p>
+    <w:p>
+      <w:pPr>
+        <w:keepNext w:val="0"/>
+        <w:keepLines w:val="0"/>
+      </w:pPr>
+      <w:r>
+        <w:t>Steve</w:t>
+      </w:r>
+      <w:r>
+        <w:t xml:space="preserve"> asks</w:t>
+      </w:r>
+      <w:r>
+        <w:t>, “W</w:t>
+      </w:r>
+      <w:r>
+        <w:t>ho</w:t>
+      </w:r>
+      <w:r>
+        <w:t xml:space="preserve"> i</w:t>
+      </w:r>
+      <w:r>
+        <w:t>s the driver</w:t>
+      </w:r>
+      <w:r>
+        <w:t>,</w:t>
+      </w:r>
+      <w:r>
+        <w:t xml:space="preserve"> and where are we going</w:t>
+      </w:r>
+      <w:r>
+        <w:t>? Are you sure about this</w:t>
+      </w:r>
+      <w:r>
+        <w:t>,</w:t>
+      </w:r>
+      <w:r>
+        <w:t xml:space="preserve"> because it smells like rain?”</w:t>
+      </w:r>
+    </w:p>
+    <w:p>
+      <w:pPr>
+        <w:keepNext w:val="0"/>
+        <w:keepLines w:val="0"/>
+      </w:pPr>
+      <w:r>
+        <w:t>Mike</w:t>
+      </w:r>
+      <w:r>
+        <w:t xml:space="preserve"> </w:t>
+      </w:r>
+      <w:r>
+        <w:t>says</w:t>
+      </w:r>
+      <w:r>
         <w:t xml:space="preserve">, </w:t>
       </w:r>
       <w:r>
-        <w:t xml:space="preserve">a </w:t>
-      </w:r>
-      <w:r>
-        <w:t xml:space="preserve">perfect day </w:t>
-      </w:r>
-      <w:r>
-        <w:t>for</w:t>
-      </w:r>
-      <w:r>
-        <w:t xml:space="preserve"> spend</w:t>
-      </w:r>
-      <w:r>
-        <w:t>ing</w:t>
-      </w:r>
-      <w:r>
-        <w:t xml:space="preserve"> </w:t>
-      </w:r>
-      <w:r>
-        <w:t xml:space="preserve">time </w:t>
-      </w:r>
-      <w:r>
-        <w:t xml:space="preserve">at the lake and then </w:t>
-      </w:r>
-      <w:r>
-        <w:t>later at</w:t>
-      </w:r>
-      <w:r>
-        <w:t xml:space="preserve"> </w:t>
+        <w:t>“I</w:t>
+      </w:r>
+      <w:r>
+        <w:t>t's a surprise</w:t>
+      </w:r>
+      <w:r>
+        <w:t>.”</w:t>
+      </w:r>
+      <w:r>
+        <w:t xml:space="preserve"> </w:t>
+      </w:r>
+      <w:r>
+        <w:t xml:space="preserve">He </w:t>
+      </w:r>
+      <w:r>
+        <w:t>finger</w:t>
+      </w:r>
+      <w:r>
+        <w:t>-</w:t>
+      </w:r>
+      <w:r>
+        <w:t>waves again</w:t>
+      </w:r>
+      <w:r>
+        <w:t xml:space="preserve"> at Mary as he sees the moment of panic cross her face</w:t>
+      </w:r>
+      <w:r>
+        <w:t xml:space="preserve">. </w:t>
+      </w:r>
+    </w:p>
+    <w:p>
+      <w:pPr>
+        <w:keepNext w:val="0"/>
+        <w:keepLines w:val="0"/>
+      </w:pPr>
+      <w:r>
+        <w:t xml:space="preserve">Mary does panic, because the rain Steve smells is not from the sky, as there are no clouds, but from her cologne. </w:t>
+      </w:r>
+      <w:r>
+        <w:t>With o</w:t>
+      </w:r>
+      <w:r>
+        <w:t>ne last glare</w:t>
+      </w:r>
+      <w:r>
+        <w:t xml:space="preserve"> at her brother</w:t>
+      </w:r>
+      <w:r>
+        <w:t>s</w:t>
+      </w:r>
+      <w:r>
+        <w:t xml:space="preserve"> in the back</w:t>
+      </w:r>
+      <w:r>
+        <w:t>,</w:t>
+      </w:r>
+      <w:r>
+        <w:t xml:space="preserve"> </w:t>
+      </w:r>
+      <w:r>
+        <w:t>she</w:t>
+      </w:r>
+      <w:r>
+        <w:t xml:space="preserve"> turn</w:t>
+      </w:r>
+      <w:r>
+        <w:t>s</w:t>
+      </w:r>
+      <w:r>
+        <w:t xml:space="preserve"> around</w:t>
+      </w:r>
+      <w:r>
+        <w:t xml:space="preserve"> with a small humph.</w:t>
+      </w:r>
+      <w:r>
+        <w:t xml:space="preserve"> </w:t>
+      </w:r>
+      <w:r>
+        <w:t>She</w:t>
+      </w:r>
+      <w:r>
+        <w:t xml:space="preserve"> unbuckle</w:t>
+      </w:r>
+      <w:r>
+        <w:t>s</w:t>
+      </w:r>
+      <w:r>
+        <w:t xml:space="preserve"> </w:t>
+      </w:r>
+      <w:r>
+        <w:t>her lap belt, enabling her to</w:t>
+      </w:r>
+      <w:r>
+        <w:t xml:space="preserve"> </w:t>
+      </w:r>
+      <w:r>
+        <w:t xml:space="preserve">better reach </w:t>
+      </w:r>
+      <w:r>
+        <w:t xml:space="preserve">across </w:t>
+      </w:r>
+      <w:r>
+        <w:t>Steve</w:t>
+      </w:r>
+      <w:r>
+        <w:t xml:space="preserve"> for hi</w:t>
+      </w:r>
+      <w:r>
+        <w:t>s lap belt</w:t>
+      </w:r>
+      <w:r>
+        <w:t xml:space="preserve">. </w:t>
+      </w:r>
+      <w:r>
+        <w:t>She</w:t>
+      </w:r>
+      <w:r>
+        <w:t xml:space="preserve"> lean</w:t>
+      </w:r>
+      <w:r>
+        <w:t>s</w:t>
+      </w:r>
+      <w:r>
+        <w:t xml:space="preserve"> over </w:t>
+      </w:r>
+      <w:r>
+        <w:t xml:space="preserve">and </w:t>
+      </w:r>
+      <w:r>
+        <w:t>reach</w:t>
+      </w:r>
+      <w:r>
+        <w:t>es</w:t>
+      </w:r>
+      <w:r>
+        <w:t xml:space="preserve"> for the lap belt over by the door</w:t>
+      </w:r>
+      <w:r>
+        <w:t>, but</w:t>
+      </w:r>
+      <w:r>
+        <w:t xml:space="preserve"> as</w:t>
+      </w:r>
+      <w:r>
+        <w:t xml:space="preserve"> her</w:t>
+      </w:r>
+      <w:r>
+        <w:t xml:space="preserve"> fingers cross </w:t>
+      </w:r>
+      <w:r>
+        <w:t xml:space="preserve">into </w:t>
+      </w:r>
+      <w:r>
+        <w:t>his personal space</w:t>
+      </w:r>
+      <w:r>
+        <w:t xml:space="preserve">, </w:t>
+      </w:r>
+      <w:r>
+        <w:t>without</w:t>
+      </w:r>
+      <w:r>
+        <w:t xml:space="preserve"> touching him</w:t>
+      </w:r>
+      <w:r>
+        <w:t>,</w:t>
+      </w:r>
+      <w:r>
+        <w:t xml:space="preserve"> </w:t>
+      </w:r>
+      <w:r>
+        <w:t xml:space="preserve">a percussive wave of volcanic proportions hits so hard it wakes </w:t>
+      </w:r>
+      <w:r>
+        <w:t>her.</w:t>
+      </w:r>
+      <w:r>
+        <w:t xml:space="preserve"> </w:t>
+      </w:r>
+      <w:r>
+        <w:t>She looks at the clock on her nightstand and sees i</w:t>
+      </w:r>
+      <w:r>
+        <w:t>t's 11</w:t>
+      </w:r>
+      <w:r>
+        <w:t xml:space="preserve">:11 </w:t>
+      </w:r>
+      <w:r>
+        <w:t>am.</w:t>
+      </w:r>
+    </w:p>
+    <w:p>
+      <w:pPr>
+        <w:keepNext w:val="0"/>
+        <w:keepLines w:val="0"/>
+      </w:pPr>
+      <w:r>
+        <w:t>Mary rolls back over and pulls the covers over her head. The dream is still tugging at her, and she is not ready to leave it. She closes her eyes</w:t>
+      </w:r>
+      <w:r>
+        <w:t>,</w:t>
+      </w:r>
+      <w:r>
+        <w:t xml:space="preserve"> </w:t>
+      </w:r>
+      <w:r>
+        <w:t>and it's like someone hit the pause button</w:t>
+      </w:r>
+      <w:r>
+        <w:t>.</w:t>
+      </w:r>
+      <w:r>
+        <w:t xml:space="preserve"> </w:t>
+      </w:r>
+      <w:r>
+        <w:t>Mary</w:t>
+      </w:r>
+      <w:r>
+        <w:t xml:space="preserve"> </w:t>
+      </w:r>
+      <w:r>
+        <w:t>looks in</w:t>
+      </w:r>
+      <w:r>
+        <w:t xml:space="preserve"> from the rear window</w:t>
+      </w:r>
+      <w:r>
+        <w:t xml:space="preserve"> with the scene frozen in time</w:t>
+      </w:r>
+      <w:r>
+        <w:t>. She is</w:t>
+      </w:r>
+      <w:r>
+        <w:t xml:space="preserve"> leaning over</w:t>
+      </w:r>
+      <w:r>
+        <w:t xml:space="preserve"> with one hand resting on the console as the other reaches across Steve</w:t>
+      </w:r>
+      <w:r>
+        <w:t>.</w:t>
+      </w:r>
+      <w:r>
+        <w:t xml:space="preserve"> </w:t>
+      </w:r>
+      <w:r>
+        <w:t>Her</w:t>
+      </w:r>
+      <w:r>
+        <w:t xml:space="preserve"> fingers</w:t>
+      </w:r>
+      <w:r>
+        <w:t xml:space="preserve"> are</w:t>
+      </w:r>
+      <w:r>
+        <w:t xml:space="preserve"> about even with </w:t>
+      </w:r>
+      <w:r>
+        <w:t>Steve’s</w:t>
+      </w:r>
+      <w:r>
+        <w:t xml:space="preserve"> </w:t>
+      </w:r>
+      <w:r>
+        <w:lastRenderedPageBreak/>
+        <w:t>ribcage</w:t>
+      </w:r>
+      <w:r>
+        <w:t>,</w:t>
+      </w:r>
+      <w:r>
+        <w:t xml:space="preserve"> close to</w:t>
+      </w:r>
+      <w:r>
+        <w:t xml:space="preserve"> where his heart would sit but not touching him.</w:t>
+      </w:r>
+      <w:r>
+        <w:t xml:space="preserve"> </w:t>
+      </w:r>
+      <w:r>
+        <w:t>T</w:t>
+      </w:r>
+      <w:r>
+        <w:t xml:space="preserve">hen someone hits </w:t>
       </w:r>
       <w:r>
         <w:t xml:space="preserve">the </w:t>
       </w:r>
       <w:r>
-        <w:t>carnival in town</w:t>
+        <w:t>play</w:t>
+      </w:r>
+      <w:r>
+        <w:t xml:space="preserve"> button,</w:t>
+      </w:r>
+      <w:r>
+        <w:t xml:space="preserve"> and </w:t>
+      </w:r>
+      <w:r>
+        <w:t>she is</w:t>
+      </w:r>
+      <w:r>
+        <w:t xml:space="preserve"> back in </w:t>
+      </w:r>
+      <w:r>
+        <w:t>her own body</w:t>
+      </w:r>
+      <w:r>
+        <w:t>,</w:t>
+      </w:r>
+      <w:r>
+        <w:t xml:space="preserve"> looking through her own eyes.</w:t>
+      </w:r>
+      <w:r>
+        <w:t xml:space="preserve"> </w:t>
+      </w:r>
+    </w:p>
+    <w:p>
+      <w:pPr>
+        <w:keepNext w:val="0"/>
+        <w:keepLines w:val="0"/>
+      </w:pPr>
+      <w:r>
+        <w:t>She freezes,</w:t>
+      </w:r>
+      <w:r>
+        <w:t xml:space="preserve"> hesitant because </w:t>
+      </w:r>
+      <w:r>
+        <w:t>she</w:t>
+      </w:r>
+      <w:r>
+        <w:t xml:space="preserve"> do</w:t>
+      </w:r>
+      <w:r>
+        <w:t>esn’t</w:t>
+      </w:r>
+      <w:r>
+        <w:t xml:space="preserve"> want </w:t>
+      </w:r>
+      <w:r>
+        <w:t>to trigger a</w:t>
+      </w:r>
+      <w:r>
+        <w:t xml:space="preserve"> second shockwave</w:t>
       </w:r>
       <w:r>
         <w:t>.</w:t>
@@ -483,79 +1291,31 @@
         <w:t xml:space="preserve"> </w:t>
       </w:r>
       <w:r>
-        <w:t>Some normalcy for her brothers they don’t otherwise get, and a break from the mundane for her. T</w:t>
-      </w:r>
-      <w:r>
-        <w:t>he windows</w:t>
-      </w:r>
-      <w:r>
-        <w:t xml:space="preserve"> </w:t>
-      </w:r>
-      <w:r>
-        <w:t xml:space="preserve">are </w:t>
-      </w:r>
-      <w:r>
-        <w:t>cranked</w:t>
-      </w:r>
-      <w:r>
-        <w:t xml:space="preserve"> dow</w:t>
-      </w:r>
-      <w:r>
-        <w:t>n</w:t>
-      </w:r>
-      <w:r>
-        <w:t>,</w:t>
-      </w:r>
-      <w:r>
-        <w:t xml:space="preserve"> letting the breeze make it comfortable and not overbearing. The smell of pine, warmed earth, and sage drift</w:t>
-      </w:r>
-      <w:r>
-        <w:t>s</w:t>
-      </w:r>
-      <w:r>
-        <w:t xml:space="preserve"> through as she takes a deep breath and lets it out slowly. The peace is short</w:t>
-      </w:r>
-      <w:r>
-        <w:t>-</w:t>
-      </w:r>
-      <w:r>
-        <w:t xml:space="preserve">lived as the deep breath causes the </w:t>
-      </w:r>
-      <w:r>
-        <w:t>shelf bra in her swimsuit to roll up.</w:t>
-      </w:r>
-    </w:p>
-    <w:p>
-      <w:pPr>
-        <w:keepNext w:val="0"/>
-        <w:keepLines w:val="0"/>
-      </w:pPr>
-      <w:r>
-        <w:t xml:space="preserve">She </w:t>
-      </w:r>
-      <w:r>
-        <w:t xml:space="preserve">has </w:t>
-      </w:r>
-      <w:r>
-        <w:t xml:space="preserve">just </w:t>
-      </w:r>
-      <w:r>
-        <w:t>finishe</w:t>
-      </w:r>
-      <w:r>
-        <w:t>d</w:t>
-      </w:r>
-      <w:r>
-        <w:t xml:space="preserve"> tugging it back down when she </w:t>
-      </w:r>
-      <w:r>
-        <w:t>hear</w:t>
-      </w:r>
-      <w:r>
-        <w:t>s</w:t>
-      </w:r>
-      <w:r>
-        <w:t xml:space="preserve"> the doors swish open</w:t>
+        <w:t>She</w:t>
+      </w:r>
+      <w:r>
+        <w:t xml:space="preserve"> look</w:t>
+      </w:r>
+      <w:r>
+        <w:t>s in the back</w:t>
+      </w:r>
+      <w:r>
+        <w:t xml:space="preserve"> at Carl and Mike to see if they registered it</w:t>
+      </w:r>
+      <w:r>
+        <w:t>,</w:t>
+      </w:r>
+      <w:r>
+        <w:t xml:space="preserve"> and they did. Carl is no longer grinning and has a puzzled look on his face. Mike has a fleeting moment of fear</w:t>
+      </w:r>
+      <w:r>
+        <w:t xml:space="preserve"> </w:t>
+      </w:r>
+      <w:r>
+        <w:t>he quickly tries to hide with</w:t>
+      </w:r>
+      <w:r>
+        <w:t xml:space="preserve"> a nervous smile</w:t>
       </w:r>
       <w:r>
         <w:t>.</w:t>
@@ -564,28 +1324,22 @@
         <w:t xml:space="preserve"> </w:t>
       </w:r>
       <w:r>
-        <w:t>Mary</w:t>
-      </w:r>
-      <w:r>
-        <w:t xml:space="preserve"> look</w:t>
-      </w:r>
-      <w:r>
-        <w:t>s</w:t>
-      </w:r>
-      <w:r>
-        <w:t xml:space="preserve"> up to see </w:t>
-      </w:r>
-      <w:r>
-        <w:t>Carl</w:t>
-      </w:r>
-      <w:r>
-        <w:t xml:space="preserve"> and </w:t>
-      </w:r>
-      <w:r>
-        <w:t>Mike</w:t>
-      </w:r>
-      <w:r>
-        <w:t xml:space="preserve"> walking shoulder to shoulder with shit-eating grins on their faces</w:t>
+        <w:t>She senses</w:t>
+      </w:r>
+      <w:r>
+        <w:t xml:space="preserve"> Steve moving and </w:t>
+      </w:r>
+      <w:r>
+        <w:t>turns, looking back at him.</w:t>
+      </w:r>
+      <w:r>
+        <w:t xml:space="preserve"> </w:t>
+      </w:r>
+      <w:r>
+        <w:t>H</w:t>
+      </w:r>
+      <w:r>
+        <w:t>e's holding out the lap belt</w:t>
       </w:r>
       <w:r>
         <w:t>.</w:t>
@@ -594,10 +1348,19 @@
         <w:t xml:space="preserve"> </w:t>
       </w:r>
       <w:r>
-        <w:t>T</w:t>
-      </w:r>
-      <w:r>
-        <w:t>hey stop short of the car</w:t>
+        <w:t>With one more glare into the back seat, she takes the buckle from him and</w:t>
+      </w:r>
+      <w:r>
+        <w:t xml:space="preserve"> </w:t>
+      </w:r>
+      <w:r>
+        <w:t>latches it</w:t>
+      </w:r>
+      <w:r>
+        <w:t xml:space="preserve"> in</w:t>
+      </w:r>
+      <w:r>
+        <w:t>, cinching it tight</w:t>
       </w:r>
       <w:r>
         <w:t>.</w:t>
@@ -605,743 +1368,56 @@
       <w:r>
         <w:t xml:space="preserve"> </w:t>
       </w:r>
-      <w:r>
-        <w:t>They</w:t>
-      </w:r>
-      <w:r>
-        <w:t xml:space="preserve"> part ways to reveal </w:t>
-      </w:r>
-      <w:r>
-        <w:t>Steve</w:t>
-      </w:r>
-      <w:r>
-        <w:t>,</w:t>
-      </w:r>
-      <w:r>
-        <w:t xml:space="preserve"> blindfolded</w:t>
-      </w:r>
-      <w:r>
-        <w:t xml:space="preserve"> with a bandana.</w:t>
-      </w:r>
-      <w:r>
-        <w:t xml:space="preserve"> </w:t>
-      </w:r>
-      <w:r>
-        <w:t>It appears he is</w:t>
-      </w:r>
-      <w:r>
-        <w:t xml:space="preserve"> willingly being led to the car</w:t>
-      </w:r>
-      <w:r>
-        <w:t xml:space="preserve"> by her brothers</w:t>
-      </w:r>
-      <w:r>
-        <w:t xml:space="preserve">. </w:t>
-      </w:r>
-      <w:r>
-        <w:t>Mary feels the freeze start and begin to take hold of her, silencing any angry words she would unleash on the two.</w:t>
-      </w:r>
-    </w:p>
-    <w:p>
-      <w:pPr>
-        <w:keepNext w:val="0"/>
-        <w:keepLines w:val="0"/>
-      </w:pPr>
-      <w:r>
-        <w:t>They</w:t>
-      </w:r>
-      <w:r>
-        <w:t xml:space="preserve"> go through the awkward motion of</w:t>
-      </w:r>
-      <w:r>
-        <w:t xml:space="preserve"> </w:t>
-      </w:r>
-      <w:r>
-        <w:t>trying to stuff</w:t>
-      </w:r>
-      <w:r>
-        <w:t xml:space="preserve"> him in the front seat</w:t>
-      </w:r>
-      <w:r>
-        <w:t>. After a couple of tries imitating a police officer putting a handcuffed person in the back of a squad car, they realize they have to get in first</w:t>
-      </w:r>
-      <w:r>
-        <w:t xml:space="preserve"> or fold him in half to occupy the </w:t>
-      </w:r>
-      <w:r>
-        <w:t>back</w:t>
-      </w:r>
-      <w:r>
-        <w:t xml:space="preserve"> seats</w:t>
-      </w:r>
-      <w:r>
-        <w:t>.</w:t>
-      </w:r>
-      <w:r>
-        <w:t xml:space="preserve"> They get in</w:t>
-      </w:r>
-      <w:r>
-        <w:t>,</w:t>
-      </w:r>
-      <w:r>
-        <w:t xml:space="preserve"> and Mike half hangs out the window of the car, helping Steve to get in</w:t>
-      </w:r>
-      <w:r>
-        <w:t>to</w:t>
-      </w:r>
-      <w:r>
-        <w:t xml:space="preserve"> the front seat.</w:t>
-      </w:r>
-      <w:r>
-        <w:t xml:space="preserve"> </w:t>
-      </w:r>
-      <w:r>
-        <w:t>Mary</w:t>
-      </w:r>
-      <w:r>
-        <w:t xml:space="preserve"> turn</w:t>
-      </w:r>
-      <w:r>
-        <w:t>s</w:t>
-      </w:r>
-      <w:r>
-        <w:t xml:space="preserve"> and glare</w:t>
-      </w:r>
-      <w:r>
-        <w:t>s</w:t>
-      </w:r>
-      <w:r>
-        <w:t xml:space="preserve"> at them</w:t>
-      </w:r>
-      <w:r>
-        <w:t>.</w:t>
-      </w:r>
-      <w:r>
-        <w:t xml:space="preserve"> </w:t>
-      </w:r>
-      <w:r>
-        <w:t>Carl is</w:t>
-      </w:r>
-      <w:r>
-        <w:t xml:space="preserve"> still grinning from ear to ear</w:t>
-      </w:r>
-      <w:r>
-        <w:t>.</w:t>
-      </w:r>
-    </w:p>
-    <w:p>
-      <w:pPr>
-        <w:keepNext w:val="0"/>
-        <w:keepLines w:val="0"/>
-      </w:pPr>
-      <w:r>
-        <w:t>“G</w:t>
-      </w:r>
-      <w:r>
-        <w:t>o on and buckle him in</w:t>
-      </w:r>
-      <w:r>
-        <w:t>,”</w:t>
-      </w:r>
-      <w:r>
-        <w:t xml:space="preserve"> </w:t>
-      </w:r>
-      <w:r>
-        <w:t xml:space="preserve">Carl says, </w:t>
-      </w:r>
-      <w:r>
-        <w:t xml:space="preserve">and points suggestively </w:t>
-      </w:r>
-      <w:r>
-        <w:t>at Steve’s</w:t>
-      </w:r>
-      <w:r>
-        <w:t xml:space="preserve"> lap. </w:t>
-      </w:r>
-    </w:p>
-    <w:p>
-      <w:pPr>
-        <w:keepNext w:val="0"/>
-        <w:keepLines w:val="0"/>
-      </w:pPr>
-      <w:r>
-        <w:t>Mary looks</w:t>
-      </w:r>
-      <w:r>
-        <w:t xml:space="preserve"> </w:t>
-      </w:r>
-      <w:r>
-        <w:t xml:space="preserve">over </w:t>
-      </w:r>
-      <w:r>
-        <w:t xml:space="preserve">at </w:t>
-      </w:r>
-      <w:r>
-        <w:t>Mike</w:t>
-      </w:r>
-      <w:r>
-        <w:t>.</w:t>
-      </w:r>
-      <w:r>
-        <w:t xml:space="preserve"> </w:t>
-      </w:r>
-      <w:r>
-        <w:t>“Go on. Nice Daisy Duke outfit you got going on there</w:t>
-      </w:r>
-      <w:r>
-        <w:t>,” he comments as he finger</w:t>
-      </w:r>
-      <w:r>
-        <w:t>-</w:t>
-      </w:r>
-      <w:r>
-        <w:t>waves to prompt her.</w:t>
-      </w:r>
-    </w:p>
-    <w:p>
-      <w:pPr>
-        <w:keepNext w:val="0"/>
-        <w:keepLines w:val="0"/>
-      </w:pPr>
-      <w:r>
-        <w:t>Steve</w:t>
-      </w:r>
-      <w:r>
-        <w:t xml:space="preserve"> asks</w:t>
-      </w:r>
-      <w:r>
-        <w:t>, “W</w:t>
-      </w:r>
-      <w:r>
-        <w:t>ho</w:t>
-      </w:r>
-      <w:r>
-        <w:t xml:space="preserve"> i</w:t>
-      </w:r>
-      <w:r>
-        <w:t>s the driver</w:t>
-      </w:r>
-      <w:r>
-        <w:t>,</w:t>
-      </w:r>
-      <w:r>
-        <w:t xml:space="preserve"> and where are we going</w:t>
-      </w:r>
-      <w:r>
-        <w:t>? Are you sure about this</w:t>
-      </w:r>
-      <w:r>
-        <w:t>,</w:t>
-      </w:r>
-      <w:r>
-        <w:t xml:space="preserve"> because it smells like rain?”</w:t>
-      </w:r>
-    </w:p>
-    <w:p>
-      <w:pPr>
-        <w:keepNext w:val="0"/>
-        <w:keepLines w:val="0"/>
-      </w:pPr>
-      <w:r>
-        <w:t>Mike</w:t>
-      </w:r>
-      <w:r>
-        <w:t xml:space="preserve"> </w:t>
-      </w:r>
-      <w:r>
-        <w:t>says</w:t>
-      </w:r>
-      <w:r>
-        <w:t xml:space="preserve">, </w:t>
-      </w:r>
-      <w:r>
-        <w:t>“I</w:t>
-      </w:r>
-      <w:r>
-        <w:t>t's a surprise</w:t>
-      </w:r>
-      <w:r>
-        <w:t>.”</w:t>
-      </w:r>
-      <w:r>
-        <w:t xml:space="preserve"> </w:t>
-      </w:r>
-      <w:r>
-        <w:t xml:space="preserve">He </w:t>
-      </w:r>
-      <w:r>
-        <w:t>finger</w:t>
-      </w:r>
-      <w:r>
-        <w:t>-</w:t>
-      </w:r>
-      <w:r>
-        <w:t>waves again</w:t>
-      </w:r>
-      <w:r>
-        <w:t xml:space="preserve"> at Mary as he sees the moment of panic cross her face</w:t>
-      </w:r>
-      <w:r>
-        <w:t xml:space="preserve">. </w:t>
-      </w:r>
-    </w:p>
-    <w:p>
-      <w:pPr>
-        <w:keepNext w:val="0"/>
-        <w:keepLines w:val="0"/>
-      </w:pPr>
-      <w:r>
-        <w:t xml:space="preserve">Mary does panic, because the rain Steve smells is not from the sky, as there are no clouds, but from her cologne. </w:t>
-      </w:r>
-      <w:r>
-        <w:t>With o</w:t>
-      </w:r>
-      <w:r>
-        <w:t>ne last glare</w:t>
-      </w:r>
-      <w:r>
-        <w:t xml:space="preserve"> at her brother</w:t>
-      </w:r>
-      <w:r>
-        <w:t>s</w:t>
-      </w:r>
-      <w:r>
-        <w:t xml:space="preserve"> in the back</w:t>
-      </w:r>
-      <w:r>
-        <w:t>,</w:t>
-      </w:r>
-      <w:r>
-        <w:t xml:space="preserve"> and </w:t>
-      </w:r>
-      <w:r>
-        <w:t>she</w:t>
-      </w:r>
-      <w:r>
-        <w:t xml:space="preserve"> turn</w:t>
-      </w:r>
-      <w:r>
-        <w:t>s</w:t>
-      </w:r>
-      <w:r>
-        <w:t xml:space="preserve"> around</w:t>
-      </w:r>
-      <w:r>
-        <w:t xml:space="preserve"> with a small humph.</w:t>
-      </w:r>
-      <w:r>
-        <w:t xml:space="preserve"> </w:t>
-      </w:r>
-      <w:r>
-        <w:t>She</w:t>
-      </w:r>
-      <w:r>
-        <w:t xml:space="preserve"> unbuckle</w:t>
-      </w:r>
-      <w:r>
-        <w:t>s</w:t>
-      </w:r>
-      <w:r>
-        <w:t xml:space="preserve"> </w:t>
-      </w:r>
-      <w:r>
-        <w:t>her lap belt, enabling her to</w:t>
-      </w:r>
-      <w:r>
-        <w:t xml:space="preserve"> </w:t>
-      </w:r>
-      <w:r>
-        <w:t>better reach Steve’s lap belt</w:t>
-      </w:r>
-      <w:r>
-        <w:t xml:space="preserve">. </w:t>
-      </w:r>
-      <w:r>
-        <w:t>She</w:t>
-      </w:r>
-      <w:r>
-        <w:t xml:space="preserve"> lean</w:t>
-      </w:r>
-      <w:r>
-        <w:t>s</w:t>
-      </w:r>
-      <w:r>
-        <w:t xml:space="preserve"> over </w:t>
-      </w:r>
-      <w:r>
-        <w:t xml:space="preserve">and </w:t>
-      </w:r>
-      <w:r>
-        <w:t>reach</w:t>
-      </w:r>
-      <w:r>
-        <w:t>es</w:t>
-      </w:r>
-      <w:r>
-        <w:t xml:space="preserve"> for the lap belt over by the door</w:t>
-      </w:r>
-      <w:r>
-        <w:t>, but</w:t>
-      </w:r>
-      <w:r>
-        <w:t xml:space="preserve"> as</w:t>
-      </w:r>
-      <w:r>
-        <w:t xml:space="preserve"> her</w:t>
-      </w:r>
-      <w:r>
-        <w:t xml:space="preserve"> fingers cross </w:t>
-      </w:r>
-      <w:r>
-        <w:t xml:space="preserve">into </w:t>
-      </w:r>
-      <w:r>
-        <w:t>his personal space</w:t>
-      </w:r>
-      <w:r>
-        <w:t xml:space="preserve">, </w:t>
-      </w:r>
-      <w:r>
-        <w:t>without</w:t>
-      </w:r>
-      <w:r>
-        <w:t xml:space="preserve"> touching him</w:t>
-      </w:r>
-      <w:r>
-        <w:t>,</w:t>
-      </w:r>
-      <w:r>
-        <w:t xml:space="preserve"> </w:t>
-      </w:r>
-      <w:r>
-        <w:t xml:space="preserve">a percussive wave of volcanic proportions hits so hard it wakes </w:t>
-      </w:r>
-      <w:r>
-        <w:t>her.</w:t>
-      </w:r>
-      <w:r>
-        <w:t xml:space="preserve"> </w:t>
-      </w:r>
-      <w:r>
-        <w:t>She looks at the clock on her nightstand and sees i</w:t>
-      </w:r>
-      <w:r>
-        <w:t>t's 11</w:t>
-      </w:r>
-      <w:r>
-        <w:t xml:space="preserve">:11 </w:t>
-      </w:r>
-      <w:r>
-        <w:t>am.</w:t>
-      </w:r>
-    </w:p>
-    <w:p>
-      <w:pPr>
-        <w:keepNext w:val="0"/>
-        <w:keepLines w:val="0"/>
-      </w:pPr>
-      <w:r>
-        <w:t>Mary rolls back over and pulls the covers over her head. The dream is still tugging at her, and she is not ready to leave it. She closes her eyes</w:t>
-      </w:r>
-      <w:r>
-        <w:t>,</w:t>
-      </w:r>
-      <w:r>
-        <w:t xml:space="preserve"> </w:t>
-      </w:r>
-      <w:r>
-        <w:t>and it's like someone hit the pause button</w:t>
-      </w:r>
-      <w:r>
-        <w:t>.</w:t>
-      </w:r>
-      <w:r>
-        <w:t xml:space="preserve"> </w:t>
-      </w:r>
-      <w:r>
-        <w:t>Mary</w:t>
-      </w:r>
-      <w:r>
-        <w:t xml:space="preserve"> </w:t>
-      </w:r>
-      <w:r>
-        <w:t>looks in</w:t>
-      </w:r>
-      <w:r>
-        <w:t xml:space="preserve"> from the rear window</w:t>
-      </w:r>
-      <w:r>
-        <w:t>,</w:t>
-      </w:r>
-      <w:r>
-        <w:t xml:space="preserve"> leaning over and </w:t>
-      </w:r>
-      <w:proofErr w:type="gramStart"/>
-      <w:r>
-        <w:t>froze</w:t>
-      </w:r>
-      <w:r>
-        <w:t>n</w:t>
-      </w:r>
-      <w:proofErr w:type="gramEnd"/>
-      <w:r>
-        <w:t xml:space="preserve"> in time</w:t>
-      </w:r>
-      <w:r>
-        <w:t>.</w:t>
-      </w:r>
-      <w:r>
-        <w:t xml:space="preserve"> </w:t>
-      </w:r>
-      <w:r>
-        <w:t>Her</w:t>
-      </w:r>
-      <w:r>
-        <w:t xml:space="preserve"> fingers</w:t>
-      </w:r>
-      <w:r>
-        <w:t xml:space="preserve"> are</w:t>
-      </w:r>
-      <w:r>
-        <w:t xml:space="preserve"> about even with </w:t>
-      </w:r>
-      <w:r>
-        <w:t>Steve’s</w:t>
-      </w:r>
-      <w:r>
-        <w:t xml:space="preserve"> ribcage</w:t>
-      </w:r>
-      <w:r>
-        <w:t>,</w:t>
-      </w:r>
-      <w:r>
-        <w:t xml:space="preserve"> close to</w:t>
-      </w:r>
-      <w:r>
-        <w:t xml:space="preserve"> where his heart would sit but not touching him.</w:t>
-      </w:r>
-      <w:r>
-        <w:t xml:space="preserve"> </w:t>
-      </w:r>
-      <w:r>
-        <w:t>T</w:t>
-      </w:r>
-      <w:r>
-        <w:t xml:space="preserve">hen someone hits </w:t>
-      </w:r>
-      <w:r>
-        <w:t xml:space="preserve">the </w:t>
-      </w:r>
-      <w:r>
-        <w:t>play</w:t>
-      </w:r>
-      <w:r>
-        <w:t xml:space="preserve"> button,</w:t>
-      </w:r>
-      <w:r>
-        <w:t xml:space="preserve"> and </w:t>
-      </w:r>
-      <w:r>
-        <w:t>she is</w:t>
-      </w:r>
-      <w:r>
-        <w:t xml:space="preserve"> back in </w:t>
-      </w:r>
-      <w:r>
-        <w:t>her own body and looking through her own eyes.</w:t>
-      </w:r>
-      <w:r>
-        <w:t xml:space="preserve"> </w:t>
-      </w:r>
-    </w:p>
-    <w:p>
-      <w:pPr>
-        <w:keepNext w:val="0"/>
-        <w:keepLines w:val="0"/>
-      </w:pPr>
-      <w:r>
-        <w:t>She freezes,</w:t>
-      </w:r>
-      <w:r>
-        <w:t xml:space="preserve"> hesitant because </w:t>
-      </w:r>
-      <w:r>
-        <w:t>she</w:t>
-      </w:r>
-      <w:r>
-        <w:t xml:space="preserve"> do</w:t>
-      </w:r>
-      <w:r>
-        <w:t>esn’t</w:t>
-      </w:r>
-      <w:r>
-        <w:t xml:space="preserve"> want </w:t>
-      </w:r>
-      <w:r>
-        <w:t>to trigger a</w:t>
-      </w:r>
-      <w:r>
-        <w:t xml:space="preserve"> second shockwave</w:t>
-      </w:r>
-      <w:r>
-        <w:t>.</w:t>
-      </w:r>
-      <w:r>
-        <w:t xml:space="preserve"> </w:t>
-      </w:r>
-      <w:r>
-        <w:t>She</w:t>
-      </w:r>
-      <w:r>
-        <w:t xml:space="preserve"> look</w:t>
-      </w:r>
-      <w:r>
-        <w:t>s in the back</w:t>
-      </w:r>
-      <w:r>
-        <w:t xml:space="preserve"> at </w:t>
-      </w:r>
-      <w:r>
-        <w:t>Carl</w:t>
-      </w:r>
-      <w:r>
-        <w:t xml:space="preserve"> and </w:t>
-      </w:r>
-      <w:r>
-        <w:t>Mike</w:t>
-      </w:r>
-      <w:r>
-        <w:t xml:space="preserve"> to see if they registered it</w:t>
-      </w:r>
-      <w:r>
-        <w:t>,</w:t>
-      </w:r>
-      <w:r>
-        <w:t xml:space="preserve"> and they did. </w:t>
-      </w:r>
-      <w:r>
-        <w:t>Carl</w:t>
-      </w:r>
-      <w:r>
-        <w:t xml:space="preserve"> is no longer grinning and has </w:t>
-      </w:r>
-      <w:r>
-        <w:lastRenderedPageBreak/>
-        <w:t xml:space="preserve">a puzzled look on his face. </w:t>
-      </w:r>
-      <w:r>
-        <w:t>Mike</w:t>
-      </w:r>
-      <w:r>
-        <w:t xml:space="preserve"> has a fleeting moment of fear</w:t>
-      </w:r>
-      <w:r>
-        <w:t xml:space="preserve"> and</w:t>
-      </w:r>
-      <w:r>
-        <w:t xml:space="preserve"> then a nervous smile</w:t>
-      </w:r>
-      <w:r>
-        <w:t>.</w:t>
-      </w:r>
-      <w:r>
-        <w:t xml:space="preserve"> </w:t>
-      </w:r>
-      <w:r>
-        <w:t>She senses</w:t>
-      </w:r>
-      <w:r>
-        <w:t xml:space="preserve"> </w:t>
-      </w:r>
-      <w:r>
-        <w:t>Steve</w:t>
-      </w:r>
-      <w:r>
-        <w:t xml:space="preserve"> moving and </w:t>
-      </w:r>
-      <w:r>
-        <w:t>turns, looking back at him.</w:t>
-      </w:r>
-      <w:r>
-        <w:t xml:space="preserve"> </w:t>
-      </w:r>
+    </w:p>
+    <w:p>
+      <w:pPr>
+        <w:keepNext w:val="0"/>
+        <w:keepLines w:val="0"/>
+      </w:pPr>
       <w:r>
         <w:t>H</w:t>
       </w:r>
       <w:r>
-        <w:t>e's holding out the lap belt</w:t>
-      </w:r>
-      <w:r>
-        <w:t>.</w:t>
-      </w:r>
-      <w:r>
-        <w:t xml:space="preserve"> </w:t>
-      </w:r>
-      <w:r>
-        <w:t xml:space="preserve">With </w:t>
-      </w:r>
-      <w:r>
-        <w:t>one more glare into the back seat</w:t>
-      </w:r>
-      <w:r>
-        <w:t>,</w:t>
-      </w:r>
-      <w:r>
-        <w:t xml:space="preserve"> </w:t>
-      </w:r>
-      <w:r>
-        <w:t>she takes the buckle from him and</w:t>
-      </w:r>
-      <w:r>
-        <w:t xml:space="preserve"> </w:t>
-      </w:r>
-      <w:r>
-        <w:t>latches it</w:t>
-      </w:r>
-      <w:r>
-        <w:t xml:space="preserve"> in</w:t>
-      </w:r>
-      <w:r>
-        <w:t>.</w:t>
-      </w:r>
-      <w:r>
-        <w:t xml:space="preserve"> </w:t>
-      </w:r>
-    </w:p>
-    <w:p>
-      <w:pPr>
-        <w:keepNext w:val="0"/>
-        <w:keepLines w:val="0"/>
-      </w:pPr>
-      <w:r>
-        <w:t>H</w:t>
-      </w:r>
-      <w:r>
         <w:t>e is sitting there calmly with his hands folded in his lap</w:t>
       </w:r>
       <w:r>
-        <w:t xml:space="preserve">, </w:t>
-      </w:r>
-      <w:r>
-        <w:t>not trying to remove the blindfold</w:t>
-      </w:r>
-      <w:r>
-        <w:t>.</w:t>
-      </w:r>
-      <w:r>
-        <w:t xml:space="preserve"> </w:t>
-      </w:r>
-      <w:r>
-        <w:t>He is m</w:t>
-      </w:r>
-      <w:r>
-        <w:t>ore patient than she is</w:t>
-      </w:r>
-      <w:r>
-        <w:t>,</w:t>
-      </w:r>
-      <w:r>
-        <w:t xml:space="preserve"> and she thinks to herself, </w:t>
+        <w:t>, He is</w:t>
+      </w:r>
+      <w:r>
+        <w:t xml:space="preserve"> not trying to remove the blindfold</w:t>
+      </w:r>
+      <w:r>
+        <w:t xml:space="preserve"> and displays</w:t>
+      </w:r>
+      <w:r>
+        <w:t xml:space="preserve"> m</w:t>
+      </w:r>
+      <w:r>
+        <w:t>ore patien</w:t>
+      </w:r>
+      <w:r>
+        <w:t>ce</w:t>
+      </w:r>
+      <w:r>
+        <w:t xml:space="preserve"> than she </w:t>
+      </w:r>
+      <w:r>
+        <w:t>currently has.</w:t>
+      </w:r>
+      <w:r>
+        <w:t xml:space="preserve"> </w:t>
+      </w:r>
+      <w:r>
+        <w:t>S</w:t>
+      </w:r>
+      <w:r>
+        <w:t>he</w:t>
+      </w:r>
+      <w:r>
+        <w:t xml:space="preserve"> recalls his earlier comment and</w:t>
+      </w:r>
+      <w:r>
+        <w:t xml:space="preserve"> thinks to herself, </w:t>
       </w:r>
       <w:r>
         <w:rPr>
@@ -1408,7 +1484,13 @@
         <w:t>Steve</w:t>
       </w:r>
       <w:r>
-        <w:t>. The knot in her stomach grows.</w:t>
+        <w:t xml:space="preserve">. The knot in her stomach </w:t>
+      </w:r>
+      <w:r>
+        <w:t>tightens</w:t>
+      </w:r>
+      <w:r>
+        <w:t>.</w:t>
       </w:r>
     </w:p>
     <w:p>
@@ -1606,7 +1688,19 @@
         <w:t>, he</w:t>
       </w:r>
       <w:r>
-        <w:t xml:space="preserve"> tells Mary, “Turn </w:t>
+        <w:t xml:space="preserve"> </w:t>
+      </w:r>
+      <w:r>
+        <w:t>shout</w:t>
+      </w:r>
+      <w:r>
+        <w:t>s</w:t>
+      </w:r>
+      <w:r>
+        <w:t xml:space="preserve"> to</w:t>
+      </w:r>
+      <w:r>
+        <w:t xml:space="preserve"> Mary, “Turn </w:t>
       </w:r>
       <w:r>
         <w:t>i</w:t>
@@ -1636,39 +1730,45 @@
         <w:t>,</w:t>
       </w:r>
       <w:r>
-        <w:t xml:space="preserve"> laughing and relaxing into the mood of the day. Mary finds it difficult to watch the road and</w:t>
-      </w:r>
-      <w:r>
-        <w:t xml:space="preserve"> </w:t>
-      </w:r>
-      <w:r>
-        <w:t>the turnoff to the lake</w:t>
+        <w:t xml:space="preserve"> laughing and relaxing into the mood of the day. </w:t>
+      </w:r>
+      <w:r>
+        <w:t xml:space="preserve">Even Mary finds her voice again as she sings along with them. </w:t>
+      </w:r>
+      <w:r>
+        <w:t>Mary finds it difficult to watch the road and</w:t>
+      </w:r>
+      <w:r>
+        <w:t xml:space="preserve"> the turnoff to the lake while</w:t>
+      </w:r>
+      <w:r>
+        <w:t xml:space="preserve"> the men</w:t>
+      </w:r>
+      <w:r>
+        <w:t xml:space="preserve"> are</w:t>
+      </w:r>
+      <w:r>
+        <w:t xml:space="preserve"> doing the hand jive in their seats. As they get close to the turn off</w:t>
+      </w:r>
+      <w:r>
+        <w:t>,</w:t>
+      </w:r>
+      <w:r>
+        <w:t xml:space="preserve"> the signs, flags, and banners announcing the carnival litter the sides of the mountain and fences along the roadway. She slows down and sees Steve brace against the dash when he hears the clicking from the turn signal kick in. She resists the temptation to reach over and use her arm to brace him for the turn.</w:t>
+      </w:r>
+    </w:p>
+    <w:p>
+      <w:pPr>
+        <w:keepNext w:val="0"/>
+        <w:keepLines w:val="0"/>
+      </w:pPr>
+      <w:r>
+        <w:t>Mary pulls onto the dirt road and gets around the first curve when she is stopped by the park rangers directing traffic and parking. There is hardly anyone here this early in the day. Mary hands the ranger her parking pass and permits</w:t>
       </w:r>
       <w:r>
         <w:t xml:space="preserve"> while</w:t>
       </w:r>
       <w:r>
-        <w:t xml:space="preserve"> the men</w:t>
-      </w:r>
-      <w:r>
-        <w:t xml:space="preserve"> are</w:t>
-      </w:r>
-      <w:r>
-        <w:t xml:space="preserve"> doing the hand jive in their seats. As they get close to the turn off the signs, flags, and banners announcing the carnival litter the sides of the mountain and fences along the roadway. She slows down and sees Steve brace against the dash when he hears the clicking from the turn signal kick in. She resists the temptation to reach over and use her arm to brace him for the turn.</w:t>
-      </w:r>
-    </w:p>
-    <w:p>
-      <w:pPr>
-        <w:keepNext w:val="0"/>
-        <w:keepLines w:val="0"/>
-      </w:pPr>
-      <w:r>
-        <w:t>Mary pulls onto the dirt road and gets around the first curve when she is stopped by the park rangers directing traffic and parking. There is hardly anyone here this early in the day. Mary hands the ranger her parking pass and permits</w:t>
-      </w:r>
-      <w:r>
-        <w:t xml:space="preserve"> while</w:t>
-      </w:r>
-      <w:r>
         <w:t xml:space="preserve"> comment</w:t>
       </w:r>
       <w:r>
@@ -1690,6 +1790,7 @@
         <w:keepLines w:val="0"/>
       </w:pPr>
       <w:r>
+        <w:lastRenderedPageBreak/>
         <w:t>She goes through another series of s-turns before arriving at what is usually the</w:t>
       </w:r>
       <w:r>
@@ -1735,10 +1836,13 @@
         <w:t>that is</w:t>
       </w:r>
       <w:r>
-        <w:t xml:space="preserve"> crystal blue with white sand, </w:t>
-      </w:r>
-      <w:r>
-        <w:t>for a beach sprinkled with dark obsidian sand. In the clearing</w:t>
+        <w:t xml:space="preserve"> crystal blue with white sand </w:t>
+      </w:r>
+      <w:r>
+        <w:t>and</w:t>
+      </w:r>
+      <w:r>
+        <w:t xml:space="preserve"> a beach sprinkled with dark obsidian sand. In the clearing</w:t>
       </w:r>
       <w:r>
         <w:t>,</w:t>
@@ -1771,11 +1875,7 @@
         <w:t xml:space="preserve"> </w:t>
       </w:r>
       <w:r>
-        <w:t xml:space="preserve">From the posters and what Mary could see through the archway of a castle gate using the river as a moat and </w:t>
-      </w:r>
-      <w:r>
-        <w:lastRenderedPageBreak/>
-        <w:t>drawbridge</w:t>
+        <w:t>From the posters and what Mary could see through the archway of a castle gate using the river as a moat and drawbridge</w:t>
       </w:r>
       <w:r>
         <w:t>,</w:t>
@@ -1784,7 +1884,13 @@
         <w:t xml:space="preserve"> it came </w:t>
       </w:r>
       <w:r>
-        <w:t xml:space="preserve">complete with vendors, acts, food booths, games, rides and in the center a carousel. </w:t>
+        <w:t>complete with vendors, acts, food booths, games, rides</w:t>
+      </w:r>
+      <w:r>
+        <w:t>,</w:t>
+      </w:r>
+      <w:r>
+        <w:t xml:space="preserve"> and in the center a carousel. </w:t>
       </w:r>
     </w:p>
     <w:p>
@@ -1820,10 +1926,7 @@
         <w:t xml:space="preserve">is about to unbuckle when </w:t>
       </w:r>
       <w:r>
-        <w:t>Carl</w:t>
-      </w:r>
-      <w:r>
-        <w:t xml:space="preserve"> and </w:t>
+        <w:t xml:space="preserve">Carl and </w:t>
       </w:r>
       <w:r>
         <w:t>Mike fold her and Steve in half with their seats to</w:t>
@@ -1832,7 +1935,13 @@
         <w:t xml:space="preserve"> hop out </w:t>
       </w:r>
       <w:r>
-        <w:t>from the back.</w:t>
+        <w:t>from the back</w:t>
+      </w:r>
+      <w:r>
+        <w:t xml:space="preserve"> through the windows instead of waiting for the doors to be opened</w:t>
+      </w:r>
+      <w:r>
+        <w:t>.</w:t>
       </w:r>
       <w:r>
         <w:t xml:space="preserve"> </w:t>
@@ -1886,10 +1995,10 @@
         <w:keepLines w:val="0"/>
       </w:pPr>
       <w:r>
-        <w:t>Mike</w:t>
-      </w:r>
-      <w:r>
-        <w:t xml:space="preserve"> </w:t>
+        <w:t xml:space="preserve">They stand and turn, heading toward the draw bridge when </w:t>
+      </w:r>
+      <w:r>
+        <w:t xml:space="preserve">Mike </w:t>
       </w:r>
       <w:r>
         <w:t>lands one last dig as</w:t>
@@ -1898,7 +2007,7 @@
         <w:t xml:space="preserve"> he hollers</w:t>
       </w:r>
       <w:r>
-        <w:t xml:space="preserve"> over his shoulder in retreat</w:t>
+        <w:t xml:space="preserve"> over his shoulder</w:t>
       </w:r>
       <w:r>
         <w:t xml:space="preserve">, </w:t>
@@ -2099,13 +2208,16 @@
         <w:t xml:space="preserve"> fingers up his neck</w:t>
       </w:r>
       <w:r>
-        <w:t>,</w:t>
-      </w:r>
-      <w:r>
-        <w:t xml:space="preserve"> and </w:t>
-      </w:r>
-      <w:r>
-        <w:t>when she</w:t>
+        <w:t xml:space="preserve"> to let him feel her progress.</w:t>
+      </w:r>
+      <w:r>
+        <w:t xml:space="preserve"> </w:t>
+      </w:r>
+      <w:r>
+        <w:t>W</w:t>
+      </w:r>
+      <w:r>
+        <w:t>hen she</w:t>
       </w:r>
       <w:r>
         <w:t xml:space="preserve"> get</w:t>
@@ -2210,7 +2322,13 @@
         <w:t>,</w:t>
       </w:r>
       <w:r>
-        <w:t xml:space="preserve"> because I know it’s you. They really were devious today, weren’t they?”</w:t>
+        <w:t xml:space="preserve"> because I know it’s you</w:t>
+      </w:r>
+      <w:r>
+        <w:t>, Mary</w:t>
+      </w:r>
+      <w:r>
+        <w:t>. They really were devious today, weren’t they?”</w:t>
       </w:r>
     </w:p>
     <w:p>
@@ -2271,6 +2389,7 @@
         <w:keepLines w:val="0"/>
       </w:pPr>
       <w:r>
+        <w:lastRenderedPageBreak/>
         <w:t>Mary replies, “You are blindfolded and I’m sitting here with my eyes closed</w:t>
       </w:r>
       <w:r>
@@ -2322,361 +2441,409 @@
         <w:keepLines w:val="0"/>
       </w:pPr>
       <w:r>
+        <w:t>Steve chuckles again. “</w:t>
+      </w:r>
+      <w:r>
+        <w:t>No,</w:t>
+      </w:r>
+      <w:r>
+        <w:t xml:space="preserve"> it’s not that I was going to remove it, but would you please wipe the trickle of sweat next to my ear</w:t>
+      </w:r>
+      <w:r>
+        <w:t>,</w:t>
+      </w:r>
+      <w:r>
+        <w:t xml:space="preserve"> as it’s getting warm in here</w:t>
+      </w:r>
+      <w:r>
+        <w:t>,</w:t>
+      </w:r>
+      <w:r>
+        <w:t xml:space="preserve"> before it drives me crazy</w:t>
+      </w:r>
+      <w:r>
+        <w:t>.</w:t>
+      </w:r>
+      <w:r>
+        <w:t xml:space="preserve"> Please.</w:t>
+      </w:r>
+      <w:r>
+        <w:t>”</w:t>
+      </w:r>
+    </w:p>
+    <w:p>
+      <w:pPr>
+        <w:keepNext w:val="0"/>
+        <w:keepLines w:val="0"/>
+      </w:pPr>
+      <w:r>
+        <w:t>Mary leans back and sees the path of the drop of sweat from his temple angling toward his ear</w:t>
+      </w:r>
+      <w:r>
+        <w:t>,</w:t>
+      </w:r>
+      <w:r>
+        <w:t xml:space="preserve"> ready to drip into the open</w:t>
+      </w:r>
+      <w:r>
+        <w:t>ing</w:t>
+      </w:r>
+      <w:r>
+        <w:t xml:space="preserve"> of his</w:t>
+      </w:r>
+      <w:r>
+        <w:t xml:space="preserve"> ear</w:t>
+      </w:r>
+      <w:r>
+        <w:t xml:space="preserve"> canal. She looks around for a napkin she usually has tucked by the seat and grabs one. She gently dabs the sweat from his face</w:t>
+      </w:r>
+      <w:r>
+        <w:t>,</w:t>
+      </w:r>
+      <w:r>
+        <w:t xml:space="preserve"> feeling a tingling sensation go through her. She hesitates</w:t>
+      </w:r>
+      <w:r>
+        <w:t>,</w:t>
+      </w:r>
+      <w:r>
+        <w:t xml:space="preserve"> and then reaches for the bandana</w:t>
+      </w:r>
+      <w:r>
+        <w:t>,</w:t>
+      </w:r>
+      <w:r>
+        <w:t xml:space="preserve"> start</w:t>
+      </w:r>
+      <w:r>
+        <w:t>ing</w:t>
+      </w:r>
+      <w:r>
+        <w:t xml:space="preserve"> to remove it. Again, he places his hand on hers to stop her</w:t>
+      </w:r>
+      <w:r>
+        <w:t xml:space="preserve"> hand</w:t>
+      </w:r>
+      <w:r>
+        <w:t>. She pauses as she watches him clench his jaw and swallow hard</w:t>
+      </w:r>
+      <w:r>
+        <w:t>,</w:t>
+      </w:r>
+      <w:r>
+        <w:t xml:space="preserve"> before nodding and removing his hand.</w:t>
+      </w:r>
+    </w:p>
+    <w:p>
+      <w:pPr>
+        <w:keepNext w:val="0"/>
+        <w:keepLines w:val="0"/>
+      </w:pPr>
+      <w:r>
+        <w:t xml:space="preserve">Mary tries to undo the knot but cannot with one </w:t>
+      </w:r>
+      <w:r>
+        <w:t>hand</w:t>
+      </w:r>
+      <w:r>
+        <w:t>.</w:t>
+      </w:r>
+      <w:r>
+        <w:t xml:space="preserve"> </w:t>
+      </w:r>
+      <w:r>
+        <w:t>The knot is</w:t>
+      </w:r>
+      <w:r>
+        <w:t xml:space="preserve"> </w:t>
+      </w:r>
+      <w:r>
+        <w:t>moist</w:t>
+      </w:r>
+      <w:r>
+        <w:t xml:space="preserve"> with sweat</w:t>
+      </w:r>
+      <w:r>
+        <w:t xml:space="preserve"> causing the fabric to tighten instead of loosen.</w:t>
+      </w:r>
+      <w:r>
+        <w:t xml:space="preserve"> She gently lifts</w:t>
+      </w:r>
+      <w:r>
+        <w:t>,</w:t>
+      </w:r>
+      <w:r>
+        <w:t xml:space="preserve"> hoping not to tug any hair out as she moves upward and over the top of his head</w:t>
+      </w:r>
+      <w:r>
+        <w:t>. The knot clears his forehead</w:t>
+      </w:r>
+      <w:r>
+        <w:t xml:space="preserve"> finally </w:t>
+      </w:r>
+      <w:r>
+        <w:t>dropping away from his face</w:t>
+      </w:r>
+      <w:r>
+        <w:t xml:space="preserve"> and </w:t>
+      </w:r>
+      <w:r>
+        <w:t xml:space="preserve">Mary </w:t>
+      </w:r>
+      <w:r>
+        <w:t>loop</w:t>
+      </w:r>
+      <w:r>
+        <w:t>s</w:t>
+      </w:r>
+      <w:r>
+        <w:t xml:space="preserve"> it around the stick shift between them</w:t>
+      </w:r>
+      <w:r>
+        <w:t>, settling back into her seat</w:t>
+      </w:r>
+      <w:r>
+        <w:t xml:space="preserve"> watching him</w:t>
+      </w:r>
+      <w:r>
+        <w:t>.</w:t>
+      </w:r>
+    </w:p>
+    <w:p>
+      <w:pPr>
+        <w:keepNext w:val="0"/>
+        <w:keepLines w:val="0"/>
+      </w:pPr>
+      <w:r>
+        <w:t xml:space="preserve">Steve shields his eyes as he </w:t>
+      </w:r>
+      <w:r>
+        <w:t>i</w:t>
+      </w:r>
+      <w:r>
+        <w:t>sn’t prepared for the glare of the sun. He blinks several times before his eyes adjust</w:t>
+      </w:r>
+      <w:r>
+        <w:t>,</w:t>
+      </w:r>
+      <w:r>
+        <w:t xml:space="preserve"> and he takes in his surroundings. “I… I thought it was going to be cloudy</w:t>
+      </w:r>
+      <w:r>
+        <w:t>,</w:t>
+      </w:r>
+      <w:r>
+        <w:t xml:space="preserve"> because I smelled rain earlier. Wait… I still smell rain.” He finally looks at her</w:t>
+      </w:r>
+      <w:r>
+        <w:t>,</w:t>
+      </w:r>
+      <w:r>
+        <w:t xml:space="preserve"> and Mary sees the dawn of recognition in his face</w:t>
+      </w:r>
+      <w:r>
+        <w:t>,</w:t>
+      </w:r>
+      <w:r>
+        <w:t xml:space="preserve"> that it is her he smells, not the weather.</w:t>
+      </w:r>
+    </w:p>
+    <w:p>
+      <w:pPr>
+        <w:keepNext w:val="0"/>
+        <w:keepLines w:val="0"/>
+      </w:pPr>
+      <w:r>
+        <w:t>Mary softly smiles back</w:t>
+      </w:r>
+      <w:r>
+        <w:t>,</w:t>
+      </w:r>
+      <w:r>
+        <w:t xml:space="preserve"> and lowers her eyes</w:t>
+      </w:r>
+      <w:r>
+        <w:t xml:space="preserve"> and her head</w:t>
+      </w:r>
+      <w:r>
+        <w:t>. “Yes</w:t>
+      </w:r>
+      <w:r>
+        <w:t>,</w:t>
+      </w:r>
+      <w:r>
+        <w:t xml:space="preserve"> it’s my cologne. You are not the first to comment it smells like rain on me. Do you…” Her voice catches</w:t>
+      </w:r>
+      <w:r>
+        <w:t>,</w:t>
+      </w:r>
+      <w:r>
+        <w:t xml:space="preserve"> and she tries to clear her throat. “Do you think we can continue to talk to each other now?”</w:t>
+      </w:r>
+    </w:p>
+    <w:p>
+      <w:pPr>
+        <w:keepNext w:val="0"/>
+        <w:keepLines w:val="0"/>
+      </w:pPr>
+      <w:r>
+        <w:t>Steve places a finger under her chin</w:t>
+      </w:r>
+      <w:r>
+        <w:t>,</w:t>
+      </w:r>
+      <w:r>
+        <w:t xml:space="preserve"> and lifts her head, searching in her eyes. A second shockwave hits them</w:t>
+      </w:r>
+      <w:r>
+        <w:t>, b</w:t>
+      </w:r>
+      <w:r>
+        <w:t>ut this time</w:t>
+      </w:r>
+      <w:r>
+        <w:t>,</w:t>
+      </w:r>
+      <w:r>
+        <w:t xml:space="preserve"> instead of an explosion, it</w:t>
+      </w:r>
+      <w:r>
+        <w:t xml:space="preserve"> i</w:t>
+      </w:r>
+      <w:r>
+        <w:t>s more like a wave breaking over the top of them. They smile at each other</w:t>
+      </w:r>
+      <w:r>
+        <w:t>,</w:t>
+      </w:r>
+      <w:r>
+        <w:t xml:space="preserve"> and Steve replies, “I don’t think we ever really needed words, do you?”</w:t>
+      </w:r>
+    </w:p>
+    <w:p>
+      <w:pPr>
+        <w:keepNext w:val="0"/>
+        <w:keepLines w:val="0"/>
+      </w:pPr>
+      <w:r>
+        <w:t>Mary feels the warmth spread through her cheeks</w:t>
+      </w:r>
+      <w:r>
+        <w:t>,</w:t>
+      </w:r>
+      <w:r>
+        <w:t xml:space="preserve"> flowing down her body</w:t>
+      </w:r>
+      <w:r>
+        <w:t>,</w:t>
+      </w:r>
+      <w:r>
+        <w:t xml:space="preserve"> and shakes her head no. “Want to get out of here and cool off for a bit before hitting the faire?”</w:t>
+      </w:r>
+    </w:p>
+    <w:p>
+      <w:pPr>
+        <w:keepNext w:val="0"/>
+        <w:keepLines w:val="0"/>
+      </w:pPr>
+      <w:r>
+        <w:t>Steve</w:t>
+      </w:r>
+      <w:r>
+        <w:t>’s</w:t>
+      </w:r>
+      <w:r>
+        <w:t xml:space="preserve"> lips curl into a devilish smile. “I thought you would never ask.”</w:t>
+      </w:r>
+    </w:p>
+    <w:p>
+      <w:pPr>
+        <w:keepNext w:val="0"/>
+        <w:keepLines w:val="0"/>
+      </w:pPr>
+      <w:r>
+        <w:t>The dream</w:t>
+      </w:r>
+      <w:r>
+        <w:t xml:space="preserve"> dissolves to a montage of pictures</w:t>
+      </w:r>
+      <w:r>
+        <w:t xml:space="preserve"> of</w:t>
+      </w:r>
+      <w:r>
+        <w:t xml:space="preserve"> the two of</w:t>
+      </w:r>
+      <w:r>
+        <w:t xml:space="preserve"> them</w:t>
+      </w:r>
+      <w:r>
+        <w:t xml:space="preserve"> eating</w:t>
+      </w:r>
+      <w:r>
+        <w:t>,</w:t>
+      </w:r>
+      <w:r>
+        <w:t xml:space="preserve"> laughing</w:t>
+      </w:r>
+      <w:r>
+        <w:t>,</w:t>
+      </w:r>
+      <w:r>
+        <w:t xml:space="preserve"> swimming</w:t>
+      </w:r>
+      <w:r>
+        <w:t>,</w:t>
+      </w:r>
+      <w:r>
+        <w:t xml:space="preserve"> and having fun</w:t>
+      </w:r>
+      <w:r>
+        <w:t xml:space="preserve"> on the rides and playing the games</w:t>
+      </w:r>
+      <w:r>
+        <w:t>. The</w:t>
+      </w:r>
+      <w:r>
+        <w:t xml:space="preserve">y end the evening looking for Carl and </w:t>
+      </w:r>
+      <w:r>
         <w:lastRenderedPageBreak/>
-        <w:t>Steve chuckles again. “</w:t>
-      </w:r>
-      <w:r>
-        <w:t>No,</w:t>
-      </w:r>
-      <w:r>
-        <w:t xml:space="preserve"> it’s not that I was going to remove it, but would you please wipe the trickle of sweat next to my ear</w:t>
-      </w:r>
-      <w:r>
-        <w:t>,</w:t>
-      </w:r>
-      <w:r>
-        <w:t xml:space="preserve"> as it’s getting warm in here</w:t>
-      </w:r>
-      <w:r>
-        <w:t>,</w:t>
-      </w:r>
-      <w:r>
-        <w:t xml:space="preserve"> before it drives me crazy</w:t>
+        <w:t>Mike,</w:t>
+      </w:r>
+      <w:r>
+        <w:t xml:space="preserve"> who were last seen heading toward t</w:t>
+      </w:r>
+      <w:r>
+        <w:t xml:space="preserve">he stands for </w:t>
+      </w:r>
+      <w:r>
+        <w:t>the finale</w:t>
+      </w:r>
+      <w:r>
+        <w:t xml:space="preserve"> concert</w:t>
+      </w:r>
+      <w:r>
+        <w:t>. They make three circuits around the arena area</w:t>
+      </w:r>
+      <w:r>
+        <w:t>,</w:t>
+      </w:r>
+      <w:r>
+        <w:t xml:space="preserve"> </w:t>
+      </w:r>
+      <w:r>
+        <w:t>but</w:t>
+      </w:r>
+      <w:r>
+        <w:t xml:space="preserve"> still cannot find them. They look for seats and find somewhere they could be easily spotted</w:t>
+      </w:r>
+      <w:r>
+        <w:t xml:space="preserve"> should the brothers come looking for them</w:t>
       </w:r>
       <w:r>
         <w:t>.</w:t>
       </w:r>
       <w:r>
-        <w:t xml:space="preserve"> Please.</w:t>
-      </w:r>
-      <w:r>
-        <w:t>”</w:t>
-      </w:r>
-    </w:p>
-    <w:p>
-      <w:pPr>
-        <w:keepNext w:val="0"/>
-        <w:keepLines w:val="0"/>
-      </w:pPr>
-      <w:r>
-        <w:t>Mary leans back and sees the path of the drop of sweat from his temple angling toward his ear</w:t>
-      </w:r>
-      <w:r>
-        <w:t>,</w:t>
-      </w:r>
-      <w:r>
-        <w:t xml:space="preserve"> ready to drip into the open</w:t>
-      </w:r>
-      <w:r>
-        <w:t>ing</w:t>
-      </w:r>
-      <w:r>
-        <w:t xml:space="preserve"> of his</w:t>
-      </w:r>
-      <w:r>
-        <w:t xml:space="preserve"> ear</w:t>
-      </w:r>
-      <w:r>
-        <w:t xml:space="preserve"> canal. She looks around for a napkin she usually has tucked by the seat and grabs one. She gently dabs the sweat from his face</w:t>
-      </w:r>
-      <w:r>
-        <w:t>,</w:t>
-      </w:r>
-      <w:r>
-        <w:t xml:space="preserve"> feeling a tingling sensation go through her. She hesitates</w:t>
-      </w:r>
-      <w:r>
-        <w:t>,</w:t>
-      </w:r>
-      <w:r>
-        <w:t xml:space="preserve"> and then reaches for the bandana</w:t>
-      </w:r>
-      <w:r>
-        <w:t>,</w:t>
-      </w:r>
-      <w:r>
-        <w:t xml:space="preserve"> start</w:t>
-      </w:r>
-      <w:r>
-        <w:t>ing</w:t>
-      </w:r>
-      <w:r>
-        <w:t xml:space="preserve"> to remove it. Again, he places his hand on hers to stop her</w:t>
-      </w:r>
-      <w:r>
-        <w:t xml:space="preserve"> hand</w:t>
-      </w:r>
-      <w:r>
-        <w:t>. She pauses as she watches him clench his jaw and swallow hard</w:t>
-      </w:r>
-      <w:r>
-        <w:t>,</w:t>
-      </w:r>
-      <w:r>
-        <w:t xml:space="preserve"> before nodding and removing his hand.</w:t>
-      </w:r>
-    </w:p>
-    <w:p>
-      <w:pPr>
-        <w:keepNext w:val="0"/>
-        <w:keepLines w:val="0"/>
-      </w:pPr>
-      <w:r>
-        <w:t xml:space="preserve">Mary tries to undo the knot but cannot with one </w:t>
-      </w:r>
-      <w:r>
-        <w:t>hand</w:t>
-      </w:r>
-      <w:r>
-        <w:t xml:space="preserve"> and it </w:t>
-      </w:r>
-      <w:r>
-        <w:t>moist</w:t>
-      </w:r>
-      <w:r>
-        <w:t xml:space="preserve"> with sweat. She gently lifts</w:t>
-      </w:r>
-      <w:r>
-        <w:t>,</w:t>
-      </w:r>
-      <w:r>
-        <w:t xml:space="preserve"> hoping not to tug any hair out as she moves upward and over the top of his head</w:t>
-      </w:r>
-      <w:r>
-        <w:t>,</w:t>
-      </w:r>
-      <w:r>
-        <w:t xml:space="preserve"> before finally removing it and looping it around the stick shift between them.</w:t>
-      </w:r>
-    </w:p>
-    <w:p>
-      <w:pPr>
-        <w:keepNext w:val="0"/>
-        <w:keepLines w:val="0"/>
-      </w:pPr>
-      <w:r>
-        <w:t xml:space="preserve">Steve shields his eyes as he </w:t>
-      </w:r>
-      <w:r>
-        <w:t>i</w:t>
-      </w:r>
-      <w:r>
-        <w:t>sn’t prepared for the glare of the sun. He blinks several times before his eyes adjust</w:t>
-      </w:r>
-      <w:r>
-        <w:t>,</w:t>
-      </w:r>
-      <w:r>
-        <w:t xml:space="preserve"> and he takes in his surroundings. “I… I thought it was going to be cloudy</w:t>
-      </w:r>
-      <w:r>
-        <w:t>,</w:t>
-      </w:r>
-      <w:r>
-        <w:t xml:space="preserve"> because I smelled rain earlier. Wait… I still smell rain.” He finally looks at her</w:t>
-      </w:r>
-      <w:r>
-        <w:t>,</w:t>
-      </w:r>
-      <w:r>
-        <w:t xml:space="preserve"> and Mary sees the dawn of recognition in his face</w:t>
-      </w:r>
-      <w:r>
-        <w:t>,</w:t>
-      </w:r>
-      <w:r>
-        <w:t xml:space="preserve"> that it is her he smells, not the weather.</w:t>
-      </w:r>
-    </w:p>
-    <w:p>
-      <w:pPr>
-        <w:keepNext w:val="0"/>
-        <w:keepLines w:val="0"/>
-      </w:pPr>
-      <w:r>
-        <w:t>Mary softly smiles back</w:t>
-      </w:r>
-      <w:r>
-        <w:t>,</w:t>
-      </w:r>
-      <w:r>
-        <w:t xml:space="preserve"> and lowers her eyes</w:t>
-      </w:r>
-      <w:r>
-        <w:t xml:space="preserve"> and her head</w:t>
-      </w:r>
-      <w:r>
-        <w:t>. “Yes</w:t>
-      </w:r>
-      <w:r>
-        <w:t>,</w:t>
-      </w:r>
-      <w:r>
-        <w:t xml:space="preserve"> it’s my cologne. You are not the first to comment it smells like rain on me. Do you…” Her voice catches</w:t>
-      </w:r>
-      <w:r>
-        <w:t>,</w:t>
-      </w:r>
-      <w:r>
-        <w:t xml:space="preserve"> and she tries to clear her throat. “Do you think we can continue to talk to each other now?”</w:t>
-      </w:r>
-    </w:p>
-    <w:p>
-      <w:pPr>
-        <w:keepNext w:val="0"/>
-        <w:keepLines w:val="0"/>
-      </w:pPr>
-      <w:r>
-        <w:t>Steve places a finger under her chin</w:t>
-      </w:r>
-      <w:r>
-        <w:t>,</w:t>
-      </w:r>
-      <w:r>
-        <w:t xml:space="preserve"> and lifts her head, searching in her eyes. A second shockwave hits them</w:t>
-      </w:r>
-      <w:r>
-        <w:t>, b</w:t>
-      </w:r>
-      <w:r>
-        <w:t>ut this time</w:t>
-      </w:r>
-      <w:r>
-        <w:t>,</w:t>
-      </w:r>
-      <w:r>
-        <w:t xml:space="preserve"> instead of an explosion, it</w:t>
-      </w:r>
-      <w:r>
-        <w:t xml:space="preserve"> i</w:t>
-      </w:r>
-      <w:r>
-        <w:t>s more like a wave breaking over the top of them. They smile at each other</w:t>
-      </w:r>
-      <w:r>
-        <w:t>,</w:t>
-      </w:r>
-      <w:r>
-        <w:t xml:space="preserve"> and Steve replies, “I don’t think we ever really needed words, do you?”</w:t>
-      </w:r>
-    </w:p>
-    <w:p>
-      <w:pPr>
-        <w:keepNext w:val="0"/>
-        <w:keepLines w:val="0"/>
-      </w:pPr>
-      <w:r>
-        <w:t>Mary feels the warmth spread through her cheeks</w:t>
-      </w:r>
-      <w:r>
-        <w:t>,</w:t>
-      </w:r>
-      <w:r>
-        <w:t xml:space="preserve"> flowing down her body</w:t>
-      </w:r>
-      <w:r>
-        <w:t>,</w:t>
-      </w:r>
-      <w:r>
-        <w:t xml:space="preserve"> and shakes her head no. “Want to get out of here and cool off for a bit before hitting the faire?”</w:t>
-      </w:r>
-    </w:p>
-    <w:p>
-      <w:pPr>
-        <w:keepNext w:val="0"/>
-        <w:keepLines w:val="0"/>
-      </w:pPr>
-      <w:r>
-        <w:t>Steve</w:t>
-      </w:r>
-      <w:r>
-        <w:t>’s</w:t>
-      </w:r>
-      <w:r>
-        <w:t xml:space="preserve"> lips curl into a devilish smile. “I thought you would never ask.”</w:t>
-      </w:r>
-    </w:p>
-    <w:p>
-      <w:pPr>
-        <w:keepNext w:val="0"/>
-        <w:keepLines w:val="0"/>
-      </w:pPr>
-      <w:r>
-        <w:t>The dream</w:t>
-      </w:r>
-      <w:r>
-        <w:t xml:space="preserve"> dissolves to a montage of pictures</w:t>
-      </w:r>
-      <w:r>
-        <w:t xml:space="preserve"> of</w:t>
-      </w:r>
-      <w:r>
-        <w:t xml:space="preserve"> the two of</w:t>
-      </w:r>
-      <w:r>
-        <w:t xml:space="preserve"> them</w:t>
-      </w:r>
-      <w:r>
-        <w:t xml:space="preserve"> eating</w:t>
-      </w:r>
-      <w:r>
-        <w:t>,</w:t>
-      </w:r>
-      <w:r>
-        <w:t xml:space="preserve"> laughing</w:t>
-      </w:r>
-      <w:r>
-        <w:t>,</w:t>
-      </w:r>
-      <w:r>
-        <w:t xml:space="preserve"> swimming</w:t>
-      </w:r>
-      <w:r>
-        <w:t>,</w:t>
-      </w:r>
-      <w:r>
-        <w:t xml:space="preserve"> and having fun</w:t>
-      </w:r>
-      <w:r>
-        <w:t xml:space="preserve"> on the rides and playing the games</w:t>
-      </w:r>
-      <w:r>
-        <w:t>. The</w:t>
-      </w:r>
-      <w:r>
-        <w:t xml:space="preserve">y end the evening looking for Carl and </w:t>
-      </w:r>
-      <w:r>
-        <w:t>Mike,</w:t>
-      </w:r>
-      <w:r>
-        <w:t xml:space="preserve"> who were last seen heading toward t</w:t>
-      </w:r>
-      <w:r>
-        <w:t>he stands for a concert</w:t>
-      </w:r>
-      <w:r>
-        <w:t>,</w:t>
-      </w:r>
-      <w:r>
-        <w:t xml:space="preserve"> </w:t>
-      </w:r>
-      <w:r>
-        <w:t>which is about to begin. They make three circuits around the arena area</w:t>
-      </w:r>
-      <w:r>
-        <w:t>,</w:t>
-      </w:r>
-      <w:r>
-        <w:t xml:space="preserve"> </w:t>
-      </w:r>
-      <w:r>
-        <w:t>but</w:t>
-      </w:r>
-      <w:r>
-        <w:t xml:space="preserve"> still cannot find them. They look for seats and find somewhere they could be easily spotted.</w:t>
-      </w:r>
-      <w:r>
         <w:t xml:space="preserve"> </w:t>
       </w:r>
     </w:p>
@@ -2698,81 +2865,78 @@
         <w:t xml:space="preserve"> </w:t>
       </w:r>
       <w:r>
-        <w:t>begin</w:t>
+        <w:t>full of adrenaline and sass are</w:t>
+      </w:r>
+      <w:r>
+        <w:t xml:space="preserve"> irritating </w:t>
+      </w:r>
+      <w:r>
+        <w:t>them. They</w:t>
+      </w:r>
+      <w:r>
+        <w:t xml:space="preserve"> look</w:t>
+      </w:r>
+      <w:r>
+        <w:t xml:space="preserve"> at</w:t>
+      </w:r>
+      <w:r>
+        <w:t xml:space="preserve"> each other</w:t>
+      </w:r>
+      <w:r>
+        <w:t>,</w:t>
+      </w:r>
+      <w:r>
+        <w:t xml:space="preserve"> and </w:t>
+      </w:r>
+      <w:r>
+        <w:t xml:space="preserve">with a nod between them </w:t>
+      </w:r>
+      <w:r>
+        <w:t xml:space="preserve">agree to leave. </w:t>
+      </w:r>
+      <w:r>
+        <w:t>They</w:t>
+      </w:r>
+      <w:r>
+        <w:t xml:space="preserve"> wander back to the carousel</w:t>
+      </w:r>
+      <w:r>
+        <w:t>, stopping for ice cream cones on the way.</w:t>
+      </w:r>
+      <w:r>
+        <w:t xml:space="preserve"> </w:t>
+      </w:r>
+      <w:r>
+        <w:t>H</w:t>
+      </w:r>
+      <w:r>
+        <w:t xml:space="preserve">e </w:t>
+      </w:r>
+      <w:r>
+        <w:t>chooses</w:t>
+      </w:r>
+      <w:r>
+        <w:t xml:space="preserve"> a stallion</w:t>
+      </w:r>
+      <w:r>
+        <w:t>,</w:t>
+      </w:r>
+      <w:r>
+        <w:t xml:space="preserve"> and </w:t>
+      </w:r>
+      <w:r>
+        <w:t>Mary</w:t>
+      </w:r>
+      <w:r>
+        <w:t xml:space="preserve"> </w:t>
+      </w:r>
+      <w:r>
+        <w:t>choose</w:t>
       </w:r>
       <w:r>
         <w:t>s</w:t>
       </w:r>
       <w:r>
-        <w:t xml:space="preserve"> irritating </w:t>
-      </w:r>
-      <w:r>
-        <w:t>them. They</w:t>
-      </w:r>
-      <w:r>
-        <w:t xml:space="preserve"> look</w:t>
-      </w:r>
-      <w:r>
-        <w:t xml:space="preserve"> at</w:t>
-      </w:r>
-      <w:r>
-        <w:t xml:space="preserve"> each other</w:t>
-      </w:r>
-      <w:r>
-        <w:t>,</w:t>
-      </w:r>
-      <w:r>
-        <w:t xml:space="preserve"> and </w:t>
-      </w:r>
-      <w:r>
-        <w:t xml:space="preserve">with a nod between them </w:t>
-      </w:r>
-      <w:r>
-        <w:t xml:space="preserve">agree to leave. </w:t>
-      </w:r>
-      <w:r>
-        <w:t>They</w:t>
-      </w:r>
-      <w:r>
-        <w:t xml:space="preserve"> wander back to the carousel</w:t>
-      </w:r>
-      <w:r>
-        <w:t>, stopping for ice cream cones on the way.</w:t>
-      </w:r>
-      <w:r>
-        <w:t xml:space="preserve"> </w:t>
-      </w:r>
-      <w:r>
-        <w:t>H</w:t>
-      </w:r>
-      <w:r>
-        <w:t xml:space="preserve">e </w:t>
-      </w:r>
-      <w:r>
-        <w:t>chooses</w:t>
-      </w:r>
-      <w:r>
-        <w:t xml:space="preserve"> a stallion</w:t>
-      </w:r>
-      <w:r>
-        <w:t>,</w:t>
-      </w:r>
-      <w:r>
-        <w:t xml:space="preserve"> and </w:t>
-      </w:r>
-      <w:r>
-        <w:t>Mary</w:t>
-      </w:r>
-      <w:r>
-        <w:t xml:space="preserve"> </w:t>
-      </w:r>
-      <w:r>
-        <w:t>choose</w:t>
-      </w:r>
-      <w:r>
-        <w:t>s</w:t>
-      </w:r>
-      <w:r>
         <w:t xml:space="preserve"> the</w:t>
       </w:r>
       <w:r>
@@ -2809,346 +2973,369 @@
         <w:keepLines w:val="0"/>
       </w:pPr>
       <w:r>
+        <w:t>Mary is startled awake with her</w:t>
+      </w:r>
+      <w:r>
+        <w:t xml:space="preserve"> phone </w:t>
+      </w:r>
+      <w:r>
+        <w:t>ringing and looks at the time.</w:t>
+      </w:r>
+      <w:r>
+        <w:t xml:space="preserve"> </w:t>
+      </w:r>
+      <w:r>
+        <w:t>I</w:t>
+      </w:r>
+      <w:r>
+        <w:t>t's 2</w:t>
+      </w:r>
+      <w:r>
+        <w:t xml:space="preserve">:22 </w:t>
+      </w:r>
+      <w:r>
+        <w:t>pm</w:t>
+      </w:r>
+      <w:r>
+        <w:t>,</w:t>
+      </w:r>
+      <w:r>
+        <w:t xml:space="preserve"> </w:t>
+      </w:r>
+      <w:r>
+        <w:t>and it’s Mike. Sleepily</w:t>
+      </w:r>
+      <w:r>
+        <w:t>,</w:t>
+      </w:r>
+      <w:r>
+        <w:t xml:space="preserve"> she squeaks out, “Hello?”</w:t>
+      </w:r>
+    </w:p>
+    <w:p>
+      <w:pPr>
+        <w:keepNext w:val="0"/>
+        <w:keepLines w:val="0"/>
+      </w:pPr>
+      <w:r>
+        <w:t>Mike</w:t>
+      </w:r>
+      <w:r>
+        <w:t xml:space="preserve"> says</w:t>
+      </w:r>
+      <w:r>
+        <w:t xml:space="preserve"> in a voice that is half worry and half amused, “Hiya Sis! Still being lazy in the bed, huh?”</w:t>
+      </w:r>
+    </w:p>
+    <w:p>
+      <w:pPr>
+        <w:keepNext w:val="0"/>
+        <w:keepLines w:val="0"/>
+      </w:pPr>
+      <w:r>
+        <w:t>“If you are gonna be bouncy and bubbly, I’m hanging up and going back to riding the carousel and eating ice cream.”</w:t>
+      </w:r>
+    </w:p>
+    <w:p>
+      <w:pPr>
+        <w:keepNext w:val="0"/>
+        <w:keepLines w:val="0"/>
+      </w:pPr>
+      <w:r>
+        <w:t>She gets only dead air on the other end of the line. She checks her phone to make sure they are still connected</w:t>
+      </w:r>
+      <w:r>
+        <w:t>,</w:t>
+      </w:r>
+      <w:r>
+        <w:t xml:space="preserve"> and confirms they are. “Did I lose you?”</w:t>
+      </w:r>
+    </w:p>
+    <w:p>
+      <w:pPr>
+        <w:keepNext w:val="0"/>
+        <w:keepLines w:val="0"/>
+      </w:pPr>
+      <w:r>
+        <w:t>“No… No… I was just calling to check on you because I felt something earlier and so did Carl.”</w:t>
+      </w:r>
+    </w:p>
+    <w:p>
+      <w:pPr>
+        <w:keepNext w:val="0"/>
+        <w:keepLines w:val="0"/>
+      </w:pPr>
+      <w:r>
+        <w:t>Mary sits up and grabs a drink of water. “Could you be a little bit more specific</w:t>
+      </w:r>
+      <w:r>
+        <w:t>?</w:t>
+      </w:r>
+      <w:r>
+        <w:t xml:space="preserve"> I’m still sleeping off meds after you woke me earlier this morning.”</w:t>
+      </w:r>
+    </w:p>
+    <w:p>
+      <w:pPr>
+        <w:keepNext w:val="0"/>
+        <w:keepLines w:val="0"/>
+      </w:pPr>
+      <w:r>
+        <w:t>“Well, it’s just… it’s just we were backstage making lunches because they catered in sandwich fixings and well, yeah I know you are two hours behind us, but we kinda felt</w:t>
+      </w:r>
+      <w:r>
+        <w:t>,</w:t>
+      </w:r>
+      <w:r>
+        <w:t xml:space="preserve"> I dunno</w:t>
+      </w:r>
+      <w:r>
+        <w:t>,</w:t>
+      </w:r>
+      <w:r>
+        <w:t xml:space="preserve"> like a punch to the gut, but then we saw Steve and he actually shuddered and he excused himself saying it must be the heat and went and laid down. We checked on him and he was napping.”</w:t>
+      </w:r>
+    </w:p>
+    <w:p>
+      <w:pPr>
+        <w:keepNext w:val="0"/>
+        <w:keepLines w:val="0"/>
+      </w:pPr>
+      <w:r>
+        <w:t>“Yeah</w:t>
+      </w:r>
+      <w:r>
+        <w:t>,</w:t>
+      </w:r>
+      <w:r>
+        <w:t xml:space="preserve"> okay</w:t>
+      </w:r>
+      <w:r>
+        <w:t>,</w:t>
+      </w:r>
+      <w:r>
+        <w:t xml:space="preserve"> and? I told you guys be careful where they get catering from. I mean they </w:t>
+      </w:r>
+      <w:proofErr w:type="spellStart"/>
+      <w:r>
+        <w:t>coulda</w:t>
+      </w:r>
+      <w:proofErr w:type="spellEnd"/>
+      <w:r>
+        <w:t xml:space="preserve"> fed you fair food.”</w:t>
+      </w:r>
+    </w:p>
+    <w:p>
+      <w:pPr>
+        <w:keepNext w:val="0"/>
+        <w:keepLines w:val="0"/>
+      </w:pPr>
+      <w:r>
+        <w:t>“I wish they had. Anyways, did you feel anything earlier? Or just a little bit ago?”</w:t>
+      </w:r>
+    </w:p>
+    <w:p>
+      <w:pPr>
+        <w:keepNext w:val="0"/>
+        <w:keepLines w:val="0"/>
+      </w:pPr>
+      <w:r>
+        <w:t>“Yeah</w:t>
+      </w:r>
+      <w:r>
+        <w:t>,</w:t>
+      </w:r>
+      <w:r>
+        <w:t xml:space="preserve"> in a dream. Why?”</w:t>
+      </w:r>
+    </w:p>
+    <w:p>
+      <w:pPr>
+        <w:keepNext w:val="0"/>
+        <w:keepLines w:val="0"/>
+      </w:pPr>
+      <w:r>
+        <w:t>“Well, I think something in the universe shifted. In a dream you said?”</w:t>
+      </w:r>
+    </w:p>
+    <w:p>
+      <w:pPr>
+        <w:keepNext w:val="0"/>
+        <w:keepLines w:val="0"/>
+      </w:pPr>
+      <w:r>
+        <w:t>“Yes, in a dream. Get to the point</w:t>
+      </w:r>
+      <w:r>
+        <w:t>,</w:t>
+      </w:r>
+      <w:r>
+        <w:t xml:space="preserve"> little brother.”</w:t>
+      </w:r>
+    </w:p>
+    <w:p>
+      <w:pPr>
+        <w:keepNext w:val="0"/>
+        <w:keepLines w:val="0"/>
+      </w:pPr>
+      <w:r>
+        <w:t>“I’m trying to. Sheesh</w:t>
+      </w:r>
+      <w:r>
+        <w:t>,</w:t>
+      </w:r>
+      <w:r>
+        <w:t xml:space="preserve"> you are impatient. You said something about eating ice cream on a carousel?”</w:t>
+      </w:r>
+    </w:p>
+    <w:p>
+      <w:pPr>
+        <w:keepNext w:val="0"/>
+        <w:keepLines w:val="0"/>
+      </w:pPr>
+      <w:r>
+        <w:t>Mary sighs. “Yes</w:t>
+      </w:r>
+      <w:r>
+        <w:t>,</w:t>
+      </w:r>
+      <w:r>
+        <w:t xml:space="preserve"> it was the dream I was having. Do you want to hear it?”</w:t>
+      </w:r>
+    </w:p>
+    <w:p>
+      <w:pPr>
+        <w:keepNext w:val="0"/>
+        <w:keepLines w:val="0"/>
+      </w:pPr>
+      <w:r>
         <w:lastRenderedPageBreak/>
-        <w:t>Mary is startled awake with her</w:t>
-      </w:r>
-      <w:r>
-        <w:t xml:space="preserve"> phone </w:t>
-      </w:r>
-      <w:r>
-        <w:t>ringing and looks at the time.</w:t>
-      </w:r>
-      <w:r>
-        <w:t xml:space="preserve"> </w:t>
-      </w:r>
-      <w:r>
-        <w:t>I</w:t>
-      </w:r>
-      <w:r>
-        <w:t>t's 2</w:t>
-      </w:r>
-      <w:r>
-        <w:t xml:space="preserve">:22 </w:t>
-      </w:r>
-      <w:r>
-        <w:t>pm</w:t>
-      </w:r>
-      <w:r>
-        <w:t>,</w:t>
-      </w:r>
-      <w:r>
-        <w:t xml:space="preserve"> </w:t>
-      </w:r>
-      <w:r>
-        <w:t>and it’s Mike. Sleepily</w:t>
-      </w:r>
-      <w:r>
-        <w:t>,</w:t>
-      </w:r>
-      <w:r>
-        <w:t xml:space="preserve"> she squeaks out, “Hello?”</w:t>
-      </w:r>
-    </w:p>
-    <w:p>
-      <w:pPr>
-        <w:keepNext w:val="0"/>
-        <w:keepLines w:val="0"/>
-      </w:pPr>
-      <w:r>
-        <w:t>Mike</w:t>
-      </w:r>
-      <w:r>
-        <w:t xml:space="preserve"> says</w:t>
-      </w:r>
-      <w:r>
-        <w:t xml:space="preserve"> in a voice that is half worry and half amused, “Hiya Sis! Still being lazy in the bed, huh?”</w:t>
-      </w:r>
-    </w:p>
-    <w:p>
-      <w:pPr>
-        <w:keepNext w:val="0"/>
-        <w:keepLines w:val="0"/>
-      </w:pPr>
-      <w:r>
-        <w:t>“If you are gonna be bouncy and bubbly, I’m hanging up and going back to riding the carousel and eating ice cream.”</w:t>
-      </w:r>
-    </w:p>
-    <w:p>
-      <w:pPr>
-        <w:keepNext w:val="0"/>
-        <w:keepLines w:val="0"/>
-      </w:pPr>
-      <w:r>
-        <w:t>She gets only dead air on the other end of the line. She checks her phone to make sure they are still connected</w:t>
-      </w:r>
-      <w:r>
-        <w:t>,</w:t>
-      </w:r>
-      <w:r>
-        <w:t xml:space="preserve"> and confirms they are. “Did I lose you?”</w:t>
-      </w:r>
-    </w:p>
-    <w:p>
-      <w:pPr>
-        <w:keepNext w:val="0"/>
-        <w:keepLines w:val="0"/>
-      </w:pPr>
-      <w:r>
-        <w:t>“No… No… I was just calling to check on you because I felt something earlier and so did Carl.”</w:t>
-      </w:r>
-    </w:p>
-    <w:p>
-      <w:pPr>
-        <w:keepNext w:val="0"/>
-        <w:keepLines w:val="0"/>
-      </w:pPr>
-      <w:r>
-        <w:t>Mary sits up and grabs a drink of water. “Could you be a little bit more specific</w:t>
-      </w:r>
-      <w:r>
-        <w:t>?</w:t>
-      </w:r>
-      <w:r>
-        <w:t xml:space="preserve"> I’m still sleeping off meds after you woke me earlier this morning.”</w:t>
-      </w:r>
-    </w:p>
-    <w:p>
-      <w:pPr>
-        <w:keepNext w:val="0"/>
-        <w:keepLines w:val="0"/>
-      </w:pPr>
-      <w:r>
-        <w:t>“Well, it’s just… it’s just we were backstage making lunches because they catered in sandwich fixings and well, yeah I know you are two hours behind us, but we kinda felt I dunno</w:t>
-      </w:r>
-      <w:r>
-        <w:t>,</w:t>
-      </w:r>
-      <w:r>
-        <w:t xml:space="preserve"> like a punch to the gut, but then we saw Steve and he actually shuddered and he excused himself saying it must be the heat and went and laid down. We checked on him and he was napping.”</w:t>
-      </w:r>
-    </w:p>
-    <w:p>
-      <w:pPr>
-        <w:keepNext w:val="0"/>
-        <w:keepLines w:val="0"/>
-      </w:pPr>
-      <w:r>
-        <w:t>“Yeah</w:t>
-      </w:r>
-      <w:r>
-        <w:t>,</w:t>
-      </w:r>
-      <w:r>
-        <w:t xml:space="preserve"> okay</w:t>
-      </w:r>
-      <w:r>
-        <w:t>,</w:t>
-      </w:r>
-      <w:r>
-        <w:t xml:space="preserve"> and? I told you guys be careful where they get catering from. I mean they </w:t>
+        <w:t>Mike sighs back. “Let me sit down first.”</w:t>
+      </w:r>
+    </w:p>
+    <w:p>
+      <w:pPr>
+        <w:keepNext w:val="0"/>
+        <w:keepLines w:val="0"/>
+      </w:pPr>
+      <w:r>
+        <w:t>Mary tells Mike about the dream and again</w:t>
+      </w:r>
+      <w:r>
+        <w:t>,</w:t>
+      </w:r>
+      <w:r>
+        <w:t xml:space="preserve"> silence answers her back after she finishes telling him. “Okay, this is getting annoying.”</w:t>
+      </w:r>
+    </w:p>
+    <w:p>
+      <w:pPr>
+        <w:keepNext w:val="0"/>
+        <w:keepLines w:val="0"/>
+      </w:pPr>
+      <w:r>
+        <w:t>“Hang on</w:t>
+      </w:r>
+      <w:r>
+        <w:t>,</w:t>
+      </w:r>
+      <w:r>
+        <w:t xml:space="preserve"> I’m thinking.”</w:t>
+      </w:r>
+    </w:p>
+    <w:p>
+      <w:pPr>
+        <w:keepNext w:val="0"/>
+        <w:keepLines w:val="0"/>
+      </w:pPr>
+      <w:r>
+        <w:t>“So that is what I smell burning.”</w:t>
+      </w:r>
+    </w:p>
+    <w:p>
+      <w:pPr>
+        <w:keepNext w:val="0"/>
+        <w:keepLines w:val="0"/>
+      </w:pPr>
+      <w:r>
+        <w:t>“You are not as clever as you think you are. Are you sitting down?”</w:t>
+      </w:r>
+    </w:p>
+    <w:p>
+      <w:pPr>
+        <w:keepNext w:val="0"/>
+        <w:keepLines w:val="0"/>
+      </w:pPr>
+      <w:r>
+        <w:t>“I’m still in bed like you teased me about. I haven’t been cleared for couch or chair yet. Stop stalling.”</w:t>
+      </w:r>
+    </w:p>
+    <w:p>
+      <w:pPr>
+        <w:keepNext w:val="0"/>
+        <w:keepLines w:val="0"/>
+      </w:pPr>
+      <w:r>
+        <w:t>“Okay don’t yell or nothing like shoot the messenger</w:t>
+      </w:r>
+      <w:r>
+        <w:t>,</w:t>
+      </w:r>
+      <w:r>
+        <w:t xml:space="preserve"> okay?”</w:t>
+      </w:r>
+    </w:p>
+    <w:p>
+      <w:pPr>
+        <w:keepNext w:val="0"/>
+        <w:keepLines w:val="0"/>
+      </w:pPr>
+      <w:r>
+        <w:t>Mary replies in a half growl, “Mikey!”</w:t>
+      </w:r>
+    </w:p>
+    <w:p>
+      <w:pPr>
+        <w:keepNext w:val="0"/>
+        <w:keepLines w:val="0"/>
+      </w:pPr>
+      <w:r>
+        <w:t>“</w:t>
+      </w:r>
+      <w:r>
+        <w:t xml:space="preserve">Steve </w:t>
+      </w:r>
+      <w:r>
+        <w:t>dreamed</w:t>
+      </w:r>
+      <w:r>
+        <w:t xml:space="preserve"> it too. Gotta run</w:t>
+      </w:r>
+      <w:r>
+        <w:t>;</w:t>
+      </w:r>
+      <w:r>
+        <w:t xml:space="preserve"> the stage manager needs me. Love </w:t>
       </w:r>
       <w:proofErr w:type="spellStart"/>
       <w:r>
-        <w:t>coulda</w:t>
+        <w:t>ya</w:t>
       </w:r>
       <w:proofErr w:type="spellEnd"/>
       <w:r>
-        <w:t xml:space="preserve"> fed you fair food.”</w:t>
-      </w:r>
-    </w:p>
-    <w:p>
-      <w:pPr>
-        <w:keepNext w:val="0"/>
-        <w:keepLines w:val="0"/>
-      </w:pPr>
-      <w:r>
-        <w:t>“I wish they had. Anyways, did you feel anything earlier? Or just a little bit ago?”</w:t>
-      </w:r>
-    </w:p>
-    <w:p>
-      <w:pPr>
-        <w:keepNext w:val="0"/>
-        <w:keepLines w:val="0"/>
-      </w:pPr>
-      <w:r>
-        <w:t>“Yeah</w:t>
-      </w:r>
-      <w:r>
-        <w:t>,</w:t>
-      </w:r>
-      <w:r>
-        <w:t xml:space="preserve"> in a dream. Why?”</w:t>
-      </w:r>
-    </w:p>
-    <w:p>
-      <w:pPr>
-        <w:keepNext w:val="0"/>
-        <w:keepLines w:val="0"/>
-      </w:pPr>
-      <w:r>
-        <w:t>“Well, I think something in the universe shifted. In a dream you said?”</w:t>
-      </w:r>
-    </w:p>
-    <w:p>
-      <w:pPr>
-        <w:keepNext w:val="0"/>
-        <w:keepLines w:val="0"/>
-      </w:pPr>
-      <w:r>
-        <w:t>“Yes, in a dream. Get to the point</w:t>
-      </w:r>
-      <w:r>
-        <w:t>,</w:t>
-      </w:r>
-      <w:r>
-        <w:t xml:space="preserve"> little brother.”</w:t>
-      </w:r>
-    </w:p>
-    <w:p>
-      <w:pPr>
-        <w:keepNext w:val="0"/>
-        <w:keepLines w:val="0"/>
-      </w:pPr>
-      <w:r>
-        <w:t>“I’m trying to. Sheesh</w:t>
-      </w:r>
-      <w:r>
-        <w:t>,</w:t>
-      </w:r>
-      <w:r>
-        <w:t xml:space="preserve"> you are impatient. You said something about eating ice cream on a carousel?”</w:t>
-      </w:r>
-    </w:p>
-    <w:p>
-      <w:pPr>
-        <w:keepNext w:val="0"/>
-        <w:keepLines w:val="0"/>
-      </w:pPr>
-      <w:r>
-        <w:t>Mary sighs. “Yes</w:t>
-      </w:r>
-      <w:r>
-        <w:t>,</w:t>
-      </w:r>
-      <w:r>
-        <w:t xml:space="preserve"> it was the dream I was having. Do you want to hear it?”</w:t>
-      </w:r>
-    </w:p>
-    <w:p>
-      <w:pPr>
-        <w:keepNext w:val="0"/>
-        <w:keepLines w:val="0"/>
-      </w:pPr>
-      <w:r>
-        <w:t>Mike sighs back. “Let me sit down first.”</w:t>
-      </w:r>
-    </w:p>
-    <w:p>
-      <w:pPr>
-        <w:keepNext w:val="0"/>
-        <w:keepLines w:val="0"/>
-      </w:pPr>
-      <w:r>
-        <w:t>Mary tells Mike about the dream and again</w:t>
-      </w:r>
-      <w:r>
-        <w:t>,</w:t>
-      </w:r>
-      <w:r>
-        <w:t xml:space="preserve"> silence answers her back after she finishes telling him. “Okay, this is getting annoying.”</w:t>
-      </w:r>
-    </w:p>
-    <w:p>
-      <w:pPr>
-        <w:keepNext w:val="0"/>
-        <w:keepLines w:val="0"/>
-      </w:pPr>
-      <w:r>
-        <w:t>“Hang on</w:t>
-      </w:r>
-      <w:r>
-        <w:t>,</w:t>
-      </w:r>
-      <w:r>
-        <w:t xml:space="preserve"> I’m thinking.”</w:t>
-      </w:r>
-    </w:p>
-    <w:p>
-      <w:pPr>
-        <w:keepNext w:val="0"/>
-        <w:keepLines w:val="0"/>
-      </w:pPr>
-      <w:r>
-        <w:t>“So that is what I smell burning.”</w:t>
-      </w:r>
-    </w:p>
-    <w:p>
-      <w:pPr>
-        <w:keepNext w:val="0"/>
-        <w:keepLines w:val="0"/>
-      </w:pPr>
-      <w:r>
-        <w:t>“You are not as clever as you think you are. Are you sitting down?”</w:t>
-      </w:r>
-    </w:p>
-    <w:p>
-      <w:pPr>
-        <w:keepNext w:val="0"/>
-        <w:keepLines w:val="0"/>
-      </w:pPr>
-      <w:r>
-        <w:lastRenderedPageBreak/>
-        <w:t>“I’m still in bed like you teased me about. I haven’t been cleared for couch or chair yet. Stop stalling.”</w:t>
-      </w:r>
-    </w:p>
-    <w:p>
-      <w:pPr>
-        <w:keepNext w:val="0"/>
-        <w:keepLines w:val="0"/>
-      </w:pPr>
-      <w:r>
-        <w:t>“Okay don’t yell or nothing like shoot the messenger</w:t>
-      </w:r>
-      <w:r>
-        <w:t>,</w:t>
-      </w:r>
-      <w:r>
-        <w:t xml:space="preserve"> okay?”</w:t>
-      </w:r>
-    </w:p>
-    <w:p>
-      <w:pPr>
-        <w:keepNext w:val="0"/>
-        <w:keepLines w:val="0"/>
-      </w:pPr>
-      <w:r>
-        <w:t>Mary replies in a half growl, “Mikey!”</w:t>
-      </w:r>
-    </w:p>
-    <w:p>
-      <w:pPr>
-        <w:keepNext w:val="0"/>
-        <w:keepLines w:val="0"/>
-      </w:pPr>
-      <w:r>
-        <w:t>“</w:t>
-      </w:r>
-      <w:r>
-        <w:t>Steve had it too. Gotta run</w:t>
-      </w:r>
-      <w:r>
-        <w:t>;</w:t>
-      </w:r>
-      <w:r>
-        <w:t xml:space="preserve"> the stage manager needs me. Love </w:t>
-      </w:r>
-      <w:proofErr w:type="spellStart"/>
-      <w:r>
-        <w:t>ya</w:t>
-      </w:r>
-      <w:proofErr w:type="spellEnd"/>
-      <w:r>
-        <w:t>, Sis.” Mike hangs up.</w:t>
+        <w:t>, Sis.”</w:t>
+      </w:r>
+    </w:p>
+    <w:p>
+      <w:pPr>
+        <w:keepNext w:val="0"/>
+        <w:keepLines w:val="0"/>
+      </w:pPr>
+      <w:r>
+        <w:t>Mike hangs up.</w:t>
+      </w:r>
+      <w:r>
+        <w:t xml:space="preserve"> Mary drops her phone.</w:t>
       </w:r>
     </w:p>
     <w:sectPr>

</xml_diff>